<commit_message>
docs(resume): add 2026 FSS complaint AI project, proposals, and internal AI tools
- Add 금융감독원 민원처리 AI 구축 PM (2026.03 – 진행 중)
- Add proposal work (금융감독원 불공정거래, 국방부 VLIW)
- Add internal projects: 나라장터 AI 공고 모니터링, RFP 제안서 작성 지원 도구
- Update 클라비 tenure to 2년 7개월, skills, core competencies

Co-Authored-By: Claude Opus 5.5 <noreply@anthropic.com>
</commit_message>
<xml_diff>
--- a/public/resume/minsung-seo-resume.docx
+++ b/public/resume/minsung-seo-resume.docx
@@ -230,7 +230,7 @@
                 <w:sz w:val="16"/>
                 <w:szCs w:val="16"/>
               </w:rPr>
-              <w:t xml:space="preserve">생성형 AI·LLM·RAG 기반 IT 프로젝트 PM 수행 (공공기관·기업 대상)</w:t>
+              <w:t xml:space="preserve">생성형 AI·LLM·RAG 기반 IT 프로젝트 PM 수행 (금융·공공기관 대상)</w:t>
             </w:r>
           </w:p>
         </w:tc>
@@ -429,7 +429,7 @@
                 <w:sz w:val="16"/>
                 <w:szCs w:val="16"/>
               </w:rPr>
-              <w:t xml:space="preserve">아이디어에서 배포까지 AI 서비스를 직접 만드는 PM</w:t>
+              <w:t xml:space="preserve">LLM 기반 사내 업무 자동화 도구 직접 기획·개발·운영 (공고 분석, 제안서 작성)</w:t>
             </w:r>
           </w:p>
         </w:tc>
@@ -573,7 +573,7 @@
                 <w:sz w:val="16"/>
                 <w:szCs w:val="16"/>
               </w:rPr>
-              <w:t xml:space="preserve">2024.04 – 현재 (1년 10개월)</w:t>
+              <w:t xml:space="preserve">2024.04 – 현재 (2년 7개월)</w:t>
             </w:r>
           </w:p>
         </w:tc>
@@ -662,7 +662,7 @@
                 <w:sz w:val="18"/>
                 <w:szCs w:val="18"/>
               </w:rPr>
-              <w:t xml:space="preserve">소상공인 상권분석 AI 챗봇 구축 PM</w:t>
+              <w:t xml:space="preserve">금융감독원 민원처리 AI 구축 PM</w:t>
             </w:r>
           </w:p>
           <w:p>
@@ -676,7 +676,7 @@
                 <w:sz w:val="15"/>
                 <w:szCs w:val="15"/>
               </w:rPr>
-              <w:t xml:space="preserve">소상공인시장진흥공단  |  2025.08 – 2025.12</w:t>
+              <w:t xml:space="preserve">금융감독원  |  2026.03 – 현재 (진행 중)</w:t>
             </w:r>
           </w:p>
           <w:p>
@@ -701,7 +701,7 @@
                 <w:sz w:val="16"/>
                 <w:szCs w:val="16"/>
               </w:rPr>
-              <w:t xml:space="preserve">자연어 기반 지역 상권분석 챗봇 PM (Waterfall) · URS·WBS·FS·IA·DB정의서·API 설계서 등 산출물 총괄</w:t>
+              <w:t xml:space="preserve">민원 유형·처리 부서 추천, 유사 민원·판례 추천, 회신문 초안 자동 작성 기능 구축 PM</w:t>
             </w:r>
           </w:p>
           <w:p>
@@ -726,7 +726,7 @@
                 <w:sz w:val="16"/>
                 <w:szCs w:val="16"/>
               </w:rPr>
-              <w:t xml:space="preserve">자사 생성형 AI 플랫폼 PoC 및 도메인 특화 LLM 구축 · 학습데이터 정의 및 생성 관리</w:t>
+              <w:t xml:space="preserve">Gemma 기반 온프레미스 LLM 환경 · RAG 및 Agentic AI 구조 적용</w:t>
             </w:r>
           </w:p>
         </w:tc>
@@ -812,7 +812,7 @@
                 <w:sz w:val="18"/>
                 <w:szCs w:val="18"/>
               </w:rPr>
-              <w:t xml:space="preserve">대한전기협회 KEPIC AI 챗봇 구축 PM</w:t>
+              <w:t xml:space="preserve">소상공인 상권분석 AI 챗봇 구축 PM</w:t>
             </w:r>
           </w:p>
           <w:p>
@@ -826,7 +826,7 @@
                 <w:sz w:val="15"/>
                 <w:szCs w:val="15"/>
               </w:rPr>
-              <w:t xml:space="preserve">대한전기협회  |  2025.03 – 2025.12</w:t>
+              <w:t xml:space="preserve">소상공인시장진흥공단  |  2025.08 – 2025.12</w:t>
             </w:r>
           </w:p>
           <w:p>
@@ -851,7 +851,7 @@
                 <w:sz w:val="16"/>
                 <w:szCs w:val="16"/>
               </w:rPr>
-              <w:t xml:space="preserve">전력산업기술기준(KEPIC) 도메인 특화 챗봇 개발 PM · WBS·IA·DB정의서·화면설계서·API 설계서 관리</w:t>
+              <w:t xml:space="preserve">자연어 기반 지역 상권분석 챗봇 PM (Waterfall) · URS·WBS·FS·IA·DB정의서·API 설계서 등 산출물 총괄</w:t>
             </w:r>
           </w:p>
           <w:p>
@@ -876,7 +876,7 @@
                 <w:sz w:val="16"/>
                 <w:szCs w:val="16"/>
               </w:rPr>
-              <w:t xml:space="preserve">데이터 전처리·데이터마트·수집 파이프라인 구축 직접 수행</w:t>
+              <w:t xml:space="preserve">자사 생성형 AI 플랫폼 PoC 및 도메인 특화 LLM 구축 · 학습데이터 정의 및 생성 관리</w:t>
             </w:r>
           </w:p>
         </w:tc>
@@ -962,7 +962,7 @@
                 <w:sz w:val="18"/>
                 <w:szCs w:val="18"/>
               </w:rPr>
-              <w:t xml:space="preserve">경기기업비서 RAG 챗봇 개발 (AI Engineer)</w:t>
+              <w:t xml:space="preserve">대한전기협회 KEPIC AI 챗봇 구축 PM</w:t>
             </w:r>
           </w:p>
           <w:p>
@@ -976,6 +976,156 @@
                 <w:sz w:val="15"/>
                 <w:szCs w:val="15"/>
               </w:rPr>
+              <w:t xml:space="preserve">대한전기협회  |  2025.03 – 2025.12</w:t>
+            </w:r>
+          </w:p>
+          <w:p>
+            <w:pPr>
+              <w:spacing w:after="20" w:before="20"/>
+            </w:pPr>
+            <w:r>
+              <w:rPr>
+                <w:rFonts w:ascii="Malgun Gothic" w:cs="Malgun Gothic" w:eastAsia="Malgun Gothic" w:hAnsi="Malgun Gothic"/>
+                <w:b/>
+                <w:bCs/>
+                <w:color w:val="059669"/>
+                <w:sz w:val="16"/>
+                <w:szCs w:val="16"/>
+              </w:rPr>
+              <w:t xml:space="preserve">·  </w:t>
+            </w:r>
+            <w:r>
+              <w:rPr>
+                <w:rFonts w:ascii="Malgun Gothic" w:cs="Malgun Gothic" w:eastAsia="Malgun Gothic" w:hAnsi="Malgun Gothic"/>
+                <w:color w:val="6B7280"/>
+                <w:sz w:val="16"/>
+                <w:szCs w:val="16"/>
+              </w:rPr>
+              <w:t xml:space="preserve">전력산업기술기준(KEPIC) 도메인 특화 챗봇 개발 PM · WBS·IA·DB정의서·화면설계서·API 설계서 관리</w:t>
+            </w:r>
+          </w:p>
+          <w:p>
+            <w:pPr>
+              <w:spacing w:after="20" w:before="20"/>
+            </w:pPr>
+            <w:r>
+              <w:rPr>
+                <w:rFonts w:ascii="Malgun Gothic" w:cs="Malgun Gothic" w:eastAsia="Malgun Gothic" w:hAnsi="Malgun Gothic"/>
+                <w:b/>
+                <w:bCs/>
+                <w:color w:val="059669"/>
+                <w:sz w:val="16"/>
+                <w:szCs w:val="16"/>
+              </w:rPr>
+              <w:t xml:space="preserve">·  </w:t>
+            </w:r>
+            <w:r>
+              <w:rPr>
+                <w:rFonts w:ascii="Malgun Gothic" w:cs="Malgun Gothic" w:eastAsia="Malgun Gothic" w:hAnsi="Malgun Gothic"/>
+                <w:color w:val="6B7280"/>
+                <w:sz w:val="16"/>
+                <w:szCs w:val="16"/>
+              </w:rPr>
+              <w:t xml:space="preserve">데이터 전처리·데이터마트·수집 파이프라인 구축 직접 수행</w:t>
+            </w:r>
+          </w:p>
+        </w:tc>
+      </w:tr>
+    </w:tbl>
+    <w:p>
+      <w:pPr>
+        <w:spacing w:after="0" w:before="60"/>
+      </w:pPr>
+      <w:r>
+        <w:rPr>
+          <w:rFonts w:ascii="Malgun Gothic" w:cs="Malgun Gothic" w:eastAsia="Malgun Gothic" w:hAnsi="Malgun Gothic"/>
+        </w:rPr>
+        <w:t xml:space="preserve"/>
+      </w:r>
+    </w:p>
+    <w:tbl>
+      <w:tblPr>
+        <w:tblW w:type="dxa" w:w="9866"/>
+        <w:tblBorders>
+          <w:top w:val="none" w:color="FFFFFF" w:sz="0"/>
+          <w:left w:val="none" w:color="FFFFFF" w:sz="0"/>
+          <w:bottom w:val="none" w:color="FFFFFF" w:sz="0"/>
+          <w:right w:val="none" w:color="FFFFFF" w:sz="0"/>
+          <w:insideH w:val="single" w:color="auto" w:sz="4"/>
+          <w:insideV w:val="single" w:color="auto" w:sz="4"/>
+        </w:tblBorders>
+      </w:tblPr>
+      <w:tblGrid>
+        <w:gridCol w:w="200"/>
+        <w:gridCol w:w="9666"/>
+      </w:tblGrid>
+      <w:tr>
+        <w:tc>
+          <w:tcPr>
+            <w:tcW w:type="dxa" w:w="200"/>
+            <w:tcBorders>
+              <w:top w:val="none" w:color="FFFFFF" w:sz="0"/>
+              <w:left w:val="single" w:color="D1FAE5" w:sz="12"/>
+              <w:bottom w:val="none" w:color="FFFFFF" w:sz="0"/>
+              <w:right w:val="none" w:color="FFFFFF" w:sz="0"/>
+            </w:tcBorders>
+            <w:tcMar>
+              <w:top w:type="dxa" w:w="0"/>
+              <w:left w:type="dxa" w:w="0"/>
+              <w:bottom w:type="dxa" w:w="0"/>
+              <w:right w:type="dxa" w:w="0"/>
+            </w:tcMar>
+          </w:tcPr>
+          <w:p>
+            <w:r>
+              <w:rPr>
+                <w:rFonts w:ascii="Malgun Gothic" w:cs="Malgun Gothic" w:eastAsia="Malgun Gothic" w:hAnsi="Malgun Gothic"/>
+              </w:rPr>
+              <w:t xml:space="preserve"/>
+            </w:r>
+          </w:p>
+        </w:tc>
+        <w:tc>
+          <w:tcPr>
+            <w:tcBorders>
+              <w:top w:val="none" w:color="FFFFFF" w:sz="0"/>
+              <w:left w:val="none" w:color="FFFFFF" w:sz="0"/>
+              <w:bottom w:val="none" w:color="FFFFFF" w:sz="0"/>
+              <w:right w:val="none" w:color="FFFFFF" w:sz="0"/>
+            </w:tcBorders>
+            <w:tcMar>
+              <w:top w:type="dxa" w:w="60"/>
+              <w:left w:type="dxa" w:w="100"/>
+              <w:bottom w:type="dxa" w:w="80"/>
+              <w:right w:type="dxa" w:w="0"/>
+            </w:tcMar>
+          </w:tcPr>
+          <w:p>
+            <w:pPr>
+              <w:spacing w:after="20" w:before="0"/>
+            </w:pPr>
+            <w:r>
+              <w:rPr>
+                <w:rFonts w:ascii="Malgun Gothic" w:cs="Malgun Gothic" w:eastAsia="Malgun Gothic" w:hAnsi="Malgun Gothic"/>
+                <w:b/>
+                <w:bCs/>
+                <w:sz w:val="18"/>
+                <w:szCs w:val="18"/>
+              </w:rPr>
+              <w:t xml:space="preserve">경기기업비서 RAG 챗봇 개발 (AI Engineer)</w:t>
+            </w:r>
+          </w:p>
+          <w:p>
+            <w:pPr>
+              <w:spacing w:after="40" w:before="0"/>
+            </w:pPr>
+            <w:r>
+              <w:rPr>
+                <w:rFonts w:ascii="Malgun Gothic" w:cs="Malgun Gothic" w:eastAsia="Malgun Gothic" w:hAnsi="Malgun Gothic"/>
+                <w:color w:val="6B7280"/>
+                <w:sz w:val="15"/>
+                <w:szCs w:val="15"/>
+              </w:rPr>
               <w:t xml:space="preserve">경기도경제과학진흥원  |  2024.05 – 2024.11</w:t>
             </w:r>
           </w:p>
@@ -1002,6 +1152,306 @@
                 <w:szCs w:val="16"/>
               </w:rPr>
               <w:t xml:space="preserve">HyperClovaX 기반 RAG 챗봇 프롬프트 튜닝 및 직접 개발 · 데이터마트·수집 파이프라인 구성 (NKS)</w:t>
+            </w:r>
+          </w:p>
+        </w:tc>
+      </w:tr>
+    </w:tbl>
+    <w:p>
+      <w:pPr>
+        <w:spacing w:after="0" w:before="60"/>
+      </w:pPr>
+      <w:r>
+        <w:rPr>
+          <w:rFonts w:ascii="Malgun Gothic" w:cs="Malgun Gothic" w:eastAsia="Malgun Gothic" w:hAnsi="Malgun Gothic"/>
+        </w:rPr>
+        <w:t xml:space="preserve"/>
+      </w:r>
+    </w:p>
+    <w:tbl>
+      <w:tblPr>
+        <w:tblW w:type="dxa" w:w="9866"/>
+        <w:tblBorders>
+          <w:top w:val="none" w:color="FFFFFF" w:sz="0"/>
+          <w:left w:val="none" w:color="FFFFFF" w:sz="0"/>
+          <w:bottom w:val="none" w:color="FFFFFF" w:sz="0"/>
+          <w:right w:val="none" w:color="FFFFFF" w:sz="0"/>
+          <w:insideH w:val="single" w:color="auto" w:sz="4"/>
+          <w:insideV w:val="single" w:color="auto" w:sz="4"/>
+        </w:tblBorders>
+      </w:tblPr>
+      <w:tblGrid>
+        <w:gridCol w:w="200"/>
+        <w:gridCol w:w="9666"/>
+      </w:tblGrid>
+      <w:tr>
+        <w:tc>
+          <w:tcPr>
+            <w:tcW w:type="dxa" w:w="200"/>
+            <w:tcBorders>
+              <w:top w:val="none" w:color="FFFFFF" w:sz="0"/>
+              <w:left w:val="single" w:color="D1FAE5" w:sz="12"/>
+              <w:bottom w:val="none" w:color="FFFFFF" w:sz="0"/>
+              <w:right w:val="none" w:color="FFFFFF" w:sz="0"/>
+            </w:tcBorders>
+            <w:tcMar>
+              <w:top w:type="dxa" w:w="0"/>
+              <w:left w:type="dxa" w:w="0"/>
+              <w:bottom w:type="dxa" w:w="0"/>
+              <w:right w:type="dxa" w:w="0"/>
+            </w:tcMar>
+          </w:tcPr>
+          <w:p>
+            <w:r>
+              <w:rPr>
+                <w:rFonts w:ascii="Malgun Gothic" w:cs="Malgun Gothic" w:eastAsia="Malgun Gothic" w:hAnsi="Malgun Gothic"/>
+              </w:rPr>
+              <w:t xml:space="preserve"/>
+            </w:r>
+          </w:p>
+        </w:tc>
+        <w:tc>
+          <w:tcPr>
+            <w:tcBorders>
+              <w:top w:val="none" w:color="FFFFFF" w:sz="0"/>
+              <w:left w:val="none" w:color="FFFFFF" w:sz="0"/>
+              <w:bottom w:val="none" w:color="FFFFFF" w:sz="0"/>
+              <w:right w:val="none" w:color="FFFFFF" w:sz="0"/>
+            </w:tcBorders>
+            <w:tcMar>
+              <w:top w:type="dxa" w:w="60"/>
+              <w:left w:type="dxa" w:w="100"/>
+              <w:bottom w:type="dxa" w:w="80"/>
+              <w:right w:type="dxa" w:w="0"/>
+            </w:tcMar>
+          </w:tcPr>
+          <w:p>
+            <w:pPr>
+              <w:spacing w:after="20" w:before="0"/>
+            </w:pPr>
+            <w:r>
+              <w:rPr>
+                <w:rFonts w:ascii="Malgun Gothic" w:cs="Malgun Gothic" w:eastAsia="Malgun Gothic" w:hAnsi="Malgun Gothic"/>
+                <w:b/>
+                <w:bCs/>
+                <w:sz w:val="18"/>
+                <w:szCs w:val="18"/>
+              </w:rPr>
+              <w:t xml:space="preserve">나라장터 AI 공고 모니터링 시스템 (사내 · 기획/개발)</w:t>
+            </w:r>
+          </w:p>
+          <w:p>
+            <w:pPr>
+              <w:spacing w:after="40" w:before="0"/>
+            </w:pPr>
+            <w:r>
+              <w:rPr>
+                <w:rFonts w:ascii="Malgun Gothic" w:cs="Malgun Gothic" w:eastAsia="Malgun Gothic" w:hAnsi="Malgun Gothic"/>
+                <w:color w:val="6B7280"/>
+                <w:sz w:val="15"/>
+                <w:szCs w:val="15"/>
+              </w:rPr>
+              <w:t xml:space="preserve">사내 프로젝트  |  2026.05 – 현재 (운영 중)</w:t>
+            </w:r>
+          </w:p>
+          <w:p>
+            <w:pPr>
+              <w:spacing w:after="20" w:before="20"/>
+            </w:pPr>
+            <w:r>
+              <w:rPr>
+                <w:rFonts w:ascii="Malgun Gothic" w:cs="Malgun Gothic" w:eastAsia="Malgun Gothic" w:hAnsi="Malgun Gothic"/>
+                <w:b/>
+                <w:bCs/>
+                <w:color w:val="059669"/>
+                <w:sz w:val="16"/>
+                <w:szCs w:val="16"/>
+              </w:rPr>
+              <w:t xml:space="preserve">·  </w:t>
+            </w:r>
+            <w:r>
+              <w:rPr>
+                <w:rFonts w:ascii="Malgun Gothic" w:cs="Malgun Gothic" w:eastAsia="Malgun Gothic" w:hAnsi="Malgun Gothic"/>
+                <w:color w:val="6B7280"/>
+                <w:sz w:val="16"/>
+                <w:szCs w:val="16"/>
+              </w:rPr>
+              <w:t xml:space="preserve">입찰공고·사전규격·발주계획 매일 자동 수집 → 첨부 RFP(PDF/HWP)까지 LLM이 읽고 자사 역량 적합도 2단계 평가 · 메일·엑셀 리포트 발송</w:t>
+            </w:r>
+          </w:p>
+          <w:p>
+            <w:pPr>
+              <w:spacing w:after="20" w:before="20"/>
+            </w:pPr>
+            <w:r>
+              <w:rPr>
+                <w:rFonts w:ascii="Malgun Gothic" w:cs="Malgun Gothic" w:eastAsia="Malgun Gothic" w:hAnsi="Malgun Gothic"/>
+                <w:b/>
+                <w:bCs/>
+                <w:color w:val="059669"/>
+                <w:sz w:val="16"/>
+                <w:szCs w:val="16"/>
+              </w:rPr>
+              <w:t xml:space="preserve">·  </w:t>
+            </w:r>
+            <w:r>
+              <w:rPr>
+                <w:rFonts w:ascii="Malgun Gothic" w:cs="Malgun Gothic" w:eastAsia="Malgun Gothic" w:hAnsi="Malgun Gothic"/>
+                <w:color w:val="6B7280"/>
+                <w:sz w:val="16"/>
+                <w:szCs w:val="16"/>
+              </w:rPr>
+              <w:t xml:space="preserve">GitHub Actions 일일 자동 실행 · 해외 IP 차단 우회용 서울 리전 다운로드 프록시(Vercel) 구축 · 영업 조직별 멀티 고객 운영</w:t>
+            </w:r>
+          </w:p>
+        </w:tc>
+      </w:tr>
+    </w:tbl>
+    <w:p>
+      <w:pPr>
+        <w:spacing w:after="0" w:before="60"/>
+      </w:pPr>
+      <w:r>
+        <w:rPr>
+          <w:rFonts w:ascii="Malgun Gothic" w:cs="Malgun Gothic" w:eastAsia="Malgun Gothic" w:hAnsi="Malgun Gothic"/>
+        </w:rPr>
+        <w:t xml:space="preserve"/>
+      </w:r>
+    </w:p>
+    <w:tbl>
+      <w:tblPr>
+        <w:tblW w:type="dxa" w:w="9866"/>
+        <w:tblBorders>
+          <w:top w:val="none" w:color="FFFFFF" w:sz="0"/>
+          <w:left w:val="none" w:color="FFFFFF" w:sz="0"/>
+          <w:bottom w:val="none" w:color="FFFFFF" w:sz="0"/>
+          <w:right w:val="none" w:color="FFFFFF" w:sz="0"/>
+          <w:insideH w:val="single" w:color="auto" w:sz="4"/>
+          <w:insideV w:val="single" w:color="auto" w:sz="4"/>
+        </w:tblBorders>
+      </w:tblPr>
+      <w:tblGrid>
+        <w:gridCol w:w="200"/>
+        <w:gridCol w:w="9666"/>
+      </w:tblGrid>
+      <w:tr>
+        <w:tc>
+          <w:tcPr>
+            <w:tcW w:type="dxa" w:w="200"/>
+            <w:tcBorders>
+              <w:top w:val="none" w:color="FFFFFF" w:sz="0"/>
+              <w:left w:val="single" w:color="D1FAE5" w:sz="12"/>
+              <w:bottom w:val="none" w:color="FFFFFF" w:sz="0"/>
+              <w:right w:val="none" w:color="FFFFFF" w:sz="0"/>
+            </w:tcBorders>
+            <w:tcMar>
+              <w:top w:type="dxa" w:w="0"/>
+              <w:left w:type="dxa" w:w="0"/>
+              <w:bottom w:type="dxa" w:w="0"/>
+              <w:right w:type="dxa" w:w="0"/>
+            </w:tcMar>
+          </w:tcPr>
+          <w:p>
+            <w:r>
+              <w:rPr>
+                <w:rFonts w:ascii="Malgun Gothic" w:cs="Malgun Gothic" w:eastAsia="Malgun Gothic" w:hAnsi="Malgun Gothic"/>
+              </w:rPr>
+              <w:t xml:space="preserve"/>
+            </w:r>
+          </w:p>
+        </w:tc>
+        <w:tc>
+          <w:tcPr>
+            <w:tcBorders>
+              <w:top w:val="none" w:color="FFFFFF" w:sz="0"/>
+              <w:left w:val="none" w:color="FFFFFF" w:sz="0"/>
+              <w:bottom w:val="none" w:color="FFFFFF" w:sz="0"/>
+              <w:right w:val="none" w:color="FFFFFF" w:sz="0"/>
+            </w:tcBorders>
+            <w:tcMar>
+              <w:top w:type="dxa" w:w="60"/>
+              <w:left w:type="dxa" w:w="100"/>
+              <w:bottom w:type="dxa" w:w="80"/>
+              <w:right w:type="dxa" w:w="0"/>
+            </w:tcMar>
+          </w:tcPr>
+          <w:p>
+            <w:pPr>
+              <w:spacing w:after="20" w:before="0"/>
+            </w:pPr>
+            <w:r>
+              <w:rPr>
+                <w:rFonts w:ascii="Malgun Gothic" w:cs="Malgun Gothic" w:eastAsia="Malgun Gothic" w:hAnsi="Malgun Gothic"/>
+                <w:b/>
+                <w:bCs/>
+                <w:sz w:val="18"/>
+                <w:szCs w:val="18"/>
+              </w:rPr>
+              <w:t xml:space="preserve">RFP 제안서 작성 지원 도구 (사내 · 기획/개발)</w:t>
+            </w:r>
+          </w:p>
+          <w:p>
+            <w:pPr>
+              <w:spacing w:after="40" w:before="0"/>
+            </w:pPr>
+            <w:r>
+              <w:rPr>
+                <w:rFonts w:ascii="Malgun Gothic" w:cs="Malgun Gothic" w:eastAsia="Malgun Gothic" w:hAnsi="Malgun Gothic"/>
+                <w:color w:val="6B7280"/>
+                <w:sz w:val="15"/>
+                <w:szCs w:val="15"/>
+              </w:rPr>
+              <w:t xml:space="preserve">사내 프로젝트  |  2026.05 – 2026.06</w:t>
+            </w:r>
+          </w:p>
+          <w:p>
+            <w:pPr>
+              <w:spacing w:after="20" w:before="20"/>
+            </w:pPr>
+            <w:r>
+              <w:rPr>
+                <w:rFonts w:ascii="Malgun Gothic" w:cs="Malgun Gothic" w:eastAsia="Malgun Gothic" w:hAnsi="Malgun Gothic"/>
+                <w:b/>
+                <w:bCs/>
+                <w:color w:val="059669"/>
+                <w:sz w:val="16"/>
+                <w:szCs w:val="16"/>
+              </w:rPr>
+              <w:t xml:space="preserve">·  </w:t>
+            </w:r>
+            <w:r>
+              <w:rPr>
+                <w:rFonts w:ascii="Malgun Gothic" w:cs="Malgun Gothic" w:eastAsia="Malgun Gothic" w:hAnsi="Malgun Gothic"/>
+                <w:color w:val="6B7280"/>
+                <w:sz w:val="16"/>
+                <w:szCs w:val="16"/>
+              </w:rPr>
+              <w:t xml:space="preserve">RFP PDF에서 요구사항·목차 자동 추출 (표·이미지 페이지는 Vision LLM OCR) · 전략가↔비평가 멀티 에이전트 토론으로 제안 전략 수립</w:t>
+            </w:r>
+          </w:p>
+          <w:p>
+            <w:pPr>
+              <w:spacing w:after="20" w:before="20"/>
+            </w:pPr>
+            <w:r>
+              <w:rPr>
+                <w:rFonts w:ascii="Malgun Gothic" w:cs="Malgun Gothic" w:eastAsia="Malgun Gothic" w:hAnsi="Malgun Gothic"/>
+                <w:b/>
+                <w:bCs/>
+                <w:color w:val="059669"/>
+                <w:sz w:val="16"/>
+                <w:szCs w:val="16"/>
+              </w:rPr>
+              <w:t xml:space="preserve">·  </w:t>
+            </w:r>
+            <w:r>
+              <w:rPr>
+                <w:rFonts w:ascii="Malgun Gothic" w:cs="Malgun Gothic" w:eastAsia="Malgun Gothic" w:hAnsi="Malgun Gothic"/>
+                <w:color w:val="6B7280"/>
+                <w:sz w:val="16"/>
+                <w:szCs w:val="16"/>
+              </w:rPr>
+              <w:t xml:space="preserve">소제목 단위 병렬 초안 생성 · 참고문서 자동 반영 · 비개발자용 원클릭 실행 패키지 배포</w:t>
             </w:r>
           </w:p>
         </w:tc>
@@ -1030,6 +1480,20 @@
           <w:szCs w:val="15"/>
         </w:rPr>
         <w:t xml:space="preserve">+ 금융감독원 민원분류 PoC, 경기기업비서2차(2025.11~), 소상공인1차(2024.09), 세종특별자치시 PoC, 한국마사회 PoC, 전라남도교육청 PoC 등</w:t>
+      </w:r>
+    </w:p>
+    <w:p>
+      <w:pPr>
+        <w:spacing w:after="0" w:before="30"/>
+      </w:pPr>
+      <w:r>
+        <w:rPr>
+          <w:rFonts w:ascii="Malgun Gothic" w:cs="Malgun Gothic" w:eastAsia="Malgun Gothic" w:hAnsi="Malgun Gothic"/>
+          <w:color w:val="6B7280"/>
+          <w:sz w:val="15"/>
+          <w:szCs w:val="15"/>
+        </w:rPr>
+        <w:t xml:space="preserve">+ 제안서 작성: 금융감독원 AI 기반 불공정거래 대응체계 마련사업(AI 부문), 국방부 VLIW 병렬 아키텍처 해석 시스템 도입</w:t>
       </w:r>
     </w:p>
     <w:p>
@@ -1944,7 +2408,7 @@
                       <w:sz w:val="16"/>
                       <w:szCs w:val="16"/>
                     </w:rPr>
-                    <w:t xml:space="preserve">LLM, RAG, HyperClovaX, Prompt Engineering, PEFT, Fine-tuning</w:t>
+                    <w:t xml:space="preserve">LLM, RAG, Agentic AI, Gemma, HyperClovaX, Prompt Engineering, PEFT, Fine-tuning</w:t>
                   </w:r>
                 </w:p>
               </w:tc>
@@ -2001,7 +2465,7 @@
                       <w:sz w:val="16"/>
                       <w:szCs w:val="16"/>
                     </w:rPr>
-                    <w:t xml:space="preserve">Python, NLP, BERT, LSTM, LangChain, FastAPI</w:t>
+                    <w:t xml:space="preserve">Python, NLP, BERT, LSTM, LangChain, FastAPI, Streamlit</w:t>
                   </w:r>
                 </w:p>
               </w:tc>
@@ -2115,7 +2579,7 @@
                       <w:sz w:val="16"/>
                       <w:szCs w:val="16"/>
                     </w:rPr>
-                    <w:t xml:space="preserve">Jenkins, ArgoCD, NKS, Git</w:t>
+                    <w:t xml:space="preserve">Jenkins, ArgoCD, NKS, GitHub Actions, Vercel, Git</w:t>
                   </w:r>
                 </w:p>
               </w:tc>
@@ -2760,7 +3224,7 @@
                 <w:sz w:val="15"/>
                 <w:szCs w:val="15"/>
               </w:rPr>
-              <w:t xml:space="preserve">IT SI·MSP  |  직원 63명  |  정규직  |  2024.04 – 현재 (1년 10개월)</w:t>
+              <w:t xml:space="preserve">IT SI·MSP  |  직원 63명  |  정규직  |  2024.04 – 현재 (2년 7개월)</w:t>
             </w:r>
           </w:p>
         </w:tc>
@@ -2820,7 +3284,7 @@
                 <w:sz w:val="19"/>
                 <w:szCs w:val="19"/>
               </w:rPr>
-              <w:t xml:space="preserve">1. 생성형 AI 상권분석 챗봇 구축 PM  </w:t>
+              <w:t xml:space="preserve">1. 금융감독원 민원처리 AI 구축 PM  </w:t>
             </w:r>
             <w:r>
               <w:rPr>
@@ -2845,7 +3309,7 @@
                 <w:sz w:val="15"/>
                 <w:szCs w:val="15"/>
               </w:rPr>
-              <w:t xml:space="preserve">고객사: 소상공인시장진흥공단  |  2025.08 – 2025.12</w:t>
+              <w:t xml:space="preserve">고객사: 금융감독원  |  2026.03 – 현재 (진행 중)</w:t>
             </w:r>
           </w:p>
           <w:p>
@@ -2887,7 +3351,7 @@
                 <w:sz w:val="16"/>
                 <w:szCs w:val="16"/>
               </w:rPr>
-              <w:t xml:space="preserve">소상공인들의 자연어 질의를 통한 지역 상권 분석 서비스 구축</w:t>
+              <w:t xml:space="preserve">민원 접수부터 회신까지의 처리 과정을 생성형 AI로 지원하여 민원 처리 업무 효율화</w:t>
             </w:r>
           </w:p>
           <w:p>
@@ -2929,7 +3393,7 @@
                 <w:sz w:val="16"/>
                 <w:szCs w:val="16"/>
               </w:rPr>
-              <w:t xml:space="preserve">자연어를 통한 지역 상권 분석 챗봇 개발</w:t>
+              <w:t xml:space="preserve">민원 유형 및 처리 부서 자동 추천</w:t>
             </w:r>
           </w:p>
           <w:p>
@@ -2955,7 +3419,59 @@
                 <w:sz w:val="16"/>
                 <w:szCs w:val="16"/>
               </w:rPr>
-              <w:t xml:space="preserve">소상공인 데이터를 활용한 분석 보고서 작성 및 AI 헤드라인 생성</w:t>
+              <w:t xml:space="preserve">유사 민원 및 관련 판례 추천</w:t>
+            </w:r>
+          </w:p>
+          <w:p>
+            <w:pPr>
+              <w:spacing w:after="20" w:before="20"/>
+              <w:ind w:left="200"/>
+            </w:pPr>
+            <w:r>
+              <w:rPr>
+                <w:rFonts w:ascii="Malgun Gothic" w:cs="Malgun Gothic" w:eastAsia="Malgun Gothic" w:hAnsi="Malgun Gothic"/>
+                <w:b/>
+                <w:bCs/>
+                <w:color w:val="059669"/>
+                <w:sz w:val="16"/>
+                <w:szCs w:val="16"/>
+              </w:rPr>
+              <w:t xml:space="preserve">3) </w:t>
+            </w:r>
+            <w:r>
+              <w:rPr>
+                <w:rFonts w:ascii="Malgun Gothic" w:cs="Malgun Gothic" w:eastAsia="Malgun Gothic" w:hAnsi="Malgun Gothic"/>
+                <w:color w:val="111827"/>
+                <w:sz w:val="16"/>
+                <w:szCs w:val="16"/>
+              </w:rPr>
+              <w:t xml:space="preserve">민원 회신문 초안 자동 작성</w:t>
+            </w:r>
+          </w:p>
+          <w:p>
+            <w:pPr>
+              <w:spacing w:after="20" w:before="20"/>
+              <w:ind w:left="200"/>
+            </w:pPr>
+            <w:r>
+              <w:rPr>
+                <w:rFonts w:ascii="Malgun Gothic" w:cs="Malgun Gothic" w:eastAsia="Malgun Gothic" w:hAnsi="Malgun Gothic"/>
+                <w:b/>
+                <w:bCs/>
+                <w:color w:val="059669"/>
+                <w:sz w:val="16"/>
+                <w:szCs w:val="16"/>
+              </w:rPr>
+              <w:t xml:space="preserve">4) </w:t>
+            </w:r>
+            <w:r>
+              <w:rPr>
+                <w:rFonts w:ascii="Malgun Gothic" w:cs="Malgun Gothic" w:eastAsia="Malgun Gothic" w:hAnsi="Malgun Gothic"/>
+                <w:color w:val="111827"/>
+                <w:sz w:val="16"/>
+                <w:szCs w:val="16"/>
+              </w:rPr>
+              <w:t xml:space="preserve">Gemma 기반 온프레미스 LLM 환경 구축 (RAG · Agentic AI)</w:t>
             </w:r>
           </w:p>
           <w:p>
@@ -2971,7 +3487,7 @@
                 <w:sz w:val="16"/>
                 <w:szCs w:val="16"/>
               </w:rPr>
-              <w:t xml:space="preserve">▸ 프로젝트 산출물</w:t>
+              <w:t xml:space="preserve">▸ 본인의 역할</w:t>
             </w:r>
           </w:p>
           <w:p>
@@ -2997,7 +3513,7 @@
                 <w:sz w:val="16"/>
                 <w:szCs w:val="16"/>
               </w:rPr>
-              <w:t xml:space="preserve">프로젝트 문서 (URS, WBS, FS, IA, DB 테이블 정의서, API 설계서 등)</w:t>
+              <w:t xml:space="preserve">전체 프로젝트 관리 및 일정·리스크·이슈 관리</w:t>
             </w:r>
           </w:p>
           <w:p>
@@ -3023,7 +3539,7 @@
                 <w:sz w:val="16"/>
                 <w:szCs w:val="16"/>
               </w:rPr>
-              <w:t xml:space="preserve">자사 생성형 AI 플랫폼 PoC</w:t>
+              <w:t xml:space="preserve">요구사항 정의 및 기능 정의</w:t>
             </w:r>
           </w:p>
           <w:p>
@@ -3049,127 +3565,7 @@
                 <w:sz w:val="16"/>
                 <w:szCs w:val="16"/>
               </w:rPr>
-              <w:t xml:space="preserve">자사 도메인 특화 LLM</w:t>
-            </w:r>
-          </w:p>
-          <w:p>
-            <w:pPr>
-              <w:spacing w:after="40" w:before="60"/>
-            </w:pPr>
-            <w:r>
-              <w:rPr>
-                <w:rFonts w:ascii="Malgun Gothic" w:cs="Malgun Gothic" w:eastAsia="Malgun Gothic" w:hAnsi="Malgun Gothic"/>
-                <w:b/>
-                <w:bCs/>
-                <w:color w:val="059669"/>
-                <w:sz w:val="16"/>
-                <w:szCs w:val="16"/>
-              </w:rPr>
-              <w:t xml:space="preserve">▸ 본인의 역할</w:t>
-            </w:r>
-          </w:p>
-          <w:p>
-            <w:pPr>
-              <w:spacing w:after="20" w:before="20"/>
-              <w:ind w:left="200"/>
-            </w:pPr>
-            <w:r>
-              <w:rPr>
-                <w:rFonts w:ascii="Malgun Gothic" w:cs="Malgun Gothic" w:eastAsia="Malgun Gothic" w:hAnsi="Malgun Gothic"/>
-                <w:b/>
-                <w:bCs/>
-                <w:color w:val="059669"/>
-                <w:sz w:val="16"/>
-                <w:szCs w:val="16"/>
-              </w:rPr>
-              <w:t xml:space="preserve">1) </w:t>
-            </w:r>
-            <w:r>
-              <w:rPr>
-                <w:rFonts w:ascii="Malgun Gothic" w:cs="Malgun Gothic" w:eastAsia="Malgun Gothic" w:hAnsi="Malgun Gothic"/>
-                <w:color w:val="111827"/>
-                <w:sz w:val="16"/>
-                <w:szCs w:val="16"/>
-              </w:rPr>
-              <w:t xml:space="preserve">전체 프로젝트 관리 및 WBS 기반 일정·리스크·이슈 관리</w:t>
-            </w:r>
-          </w:p>
-          <w:p>
-            <w:pPr>
-              <w:spacing w:after="20" w:before="20"/>
-              <w:ind w:left="200"/>
-            </w:pPr>
-            <w:r>
-              <w:rPr>
-                <w:rFonts w:ascii="Malgun Gothic" w:cs="Malgun Gothic" w:eastAsia="Malgun Gothic" w:hAnsi="Malgun Gothic"/>
-                <w:b/>
-                <w:bCs/>
-                <w:color w:val="059669"/>
-                <w:sz w:val="16"/>
-                <w:szCs w:val="16"/>
-              </w:rPr>
-              <w:t xml:space="preserve">2) </w:t>
-            </w:r>
-            <w:r>
-              <w:rPr>
-                <w:rFonts w:ascii="Malgun Gothic" w:cs="Malgun Gothic" w:eastAsia="Malgun Gothic" w:hAnsi="Malgun Gothic"/>
-                <w:color w:val="111827"/>
-                <w:sz w:val="16"/>
-                <w:szCs w:val="16"/>
-              </w:rPr>
-              <w:t xml:space="preserve">요구사항 정의, 기능 정의, IA 및 DB 설계</w:t>
-            </w:r>
-          </w:p>
-          <w:p>
-            <w:pPr>
-              <w:spacing w:after="20" w:before="20"/>
-              <w:ind w:left="200"/>
-            </w:pPr>
-            <w:r>
-              <w:rPr>
-                <w:rFonts w:ascii="Malgun Gothic" w:cs="Malgun Gothic" w:eastAsia="Malgun Gothic" w:hAnsi="Malgun Gothic"/>
-                <w:b/>
-                <w:bCs/>
-                <w:color w:val="059669"/>
-                <w:sz w:val="16"/>
-                <w:szCs w:val="16"/>
-              </w:rPr>
-              <w:t xml:space="preserve">3) </w:t>
-            </w:r>
-            <w:r>
-              <w:rPr>
-                <w:rFonts w:ascii="Malgun Gothic" w:cs="Malgun Gothic" w:eastAsia="Malgun Gothic" w:hAnsi="Malgun Gothic"/>
-                <w:color w:val="111827"/>
-                <w:sz w:val="16"/>
-                <w:szCs w:val="16"/>
-              </w:rPr>
-              <w:t xml:space="preserve">외부 협력사와의 협업 주도 — 현업부서-협력사 간 의사소통 및 이슈 조율</w:t>
-            </w:r>
-          </w:p>
-          <w:p>
-            <w:pPr>
-              <w:spacing w:after="20" w:before="20"/>
-              <w:ind w:left="200"/>
-            </w:pPr>
-            <w:r>
-              <w:rPr>
-                <w:rFonts w:ascii="Malgun Gothic" w:cs="Malgun Gothic" w:eastAsia="Malgun Gothic" w:hAnsi="Malgun Gothic"/>
-                <w:b/>
-                <w:bCs/>
-                <w:color w:val="059669"/>
-                <w:sz w:val="16"/>
-                <w:szCs w:val="16"/>
-              </w:rPr>
-              <w:t xml:space="preserve">4) </w:t>
-            </w:r>
-            <w:r>
-              <w:rPr>
-                <w:rFonts w:ascii="Malgun Gothic" w:cs="Malgun Gothic" w:eastAsia="Malgun Gothic" w:hAnsi="Malgun Gothic"/>
-                <w:color w:val="111827"/>
-                <w:sz w:val="16"/>
-                <w:szCs w:val="16"/>
-              </w:rPr>
-              <w:t xml:space="preserve">학습데이터 정의 및 생성 관리</w:t>
+              <w:t xml:space="preserve">고객사 현업부서–개발팀 간 의사소통 및 이슈 조율</w:t>
             </w:r>
           </w:p>
         </w:tc>
@@ -3229,7 +3625,7 @@
                 <w:sz w:val="19"/>
                 <w:szCs w:val="19"/>
               </w:rPr>
-              <w:t xml:space="preserve">2. 대한전기협회 KEPIC AI 챗봇 구축 PM  </w:t>
+              <w:t xml:space="preserve">2. 생성형 AI 상권분석 챗봇 구축 PM  </w:t>
             </w:r>
             <w:r>
               <w:rPr>
@@ -3254,7 +3650,7 @@
                 <w:sz w:val="15"/>
                 <w:szCs w:val="15"/>
               </w:rPr>
-              <w:t xml:space="preserve">고객사: 대한전기협회  |  2025.03 – 2025.12</w:t>
+              <w:t xml:space="preserve">고객사: 소상공인시장진흥공단  |  2025.08 – 2025.12</w:t>
             </w:r>
           </w:p>
           <w:p>
@@ -3296,7 +3692,7 @@
                 <w:sz w:val="16"/>
                 <w:szCs w:val="16"/>
               </w:rPr>
-              <w:t xml:space="preserve">KEPIC 이용자를 위한 전력산업기술기준(KEPIC) 도메인 특화 AI 챗봇 구축</w:t>
+              <w:t xml:space="preserve">소상공인들의 자연어 질의를 통한 지역 상권 분석 서비스 구축</w:t>
             </w:r>
           </w:p>
           <w:p>
@@ -3338,7 +3734,33 @@
                 <w:sz w:val="16"/>
                 <w:szCs w:val="16"/>
               </w:rPr>
-              <w:t xml:space="preserve">전력산업기술기준(KEPIC) 기반의 도메인 특화 챗봇 개발</w:t>
+              <w:t xml:space="preserve">자연어를 통한 지역 상권 분석 챗봇 개발</w:t>
+            </w:r>
+          </w:p>
+          <w:p>
+            <w:pPr>
+              <w:spacing w:after="20" w:before="20"/>
+              <w:ind w:left="200"/>
+            </w:pPr>
+            <w:r>
+              <w:rPr>
+                <w:rFonts w:ascii="Malgun Gothic" w:cs="Malgun Gothic" w:eastAsia="Malgun Gothic" w:hAnsi="Malgun Gothic"/>
+                <w:b/>
+                <w:bCs/>
+                <w:color w:val="059669"/>
+                <w:sz w:val="16"/>
+                <w:szCs w:val="16"/>
+              </w:rPr>
+              <w:t xml:space="preserve">2) </w:t>
+            </w:r>
+            <w:r>
+              <w:rPr>
+                <w:rFonts w:ascii="Malgun Gothic" w:cs="Malgun Gothic" w:eastAsia="Malgun Gothic" w:hAnsi="Malgun Gothic"/>
+                <w:color w:val="111827"/>
+                <w:sz w:val="16"/>
+                <w:szCs w:val="16"/>
+              </w:rPr>
+              <w:t xml:space="preserve">소상공인 데이터를 활용한 분석 보고서 작성 및 AI 헤드라인 생성</w:t>
             </w:r>
           </w:p>
           <w:p>
@@ -3380,7 +3802,7 @@
                 <w:sz w:val="16"/>
                 <w:szCs w:val="16"/>
               </w:rPr>
-              <w:t xml:space="preserve">프로젝트 문서 (WBS, IA, DB 테이블 정의서, 화면설계서, API 설계서 등)</w:t>
+              <w:t xml:space="preserve">프로젝트 문서 (URS, WBS, FS, IA, DB 테이블 정의서, API 설계서 등)</w:t>
             </w:r>
           </w:p>
           <w:p>
@@ -3406,7 +3828,7 @@
                 <w:sz w:val="16"/>
                 <w:szCs w:val="16"/>
               </w:rPr>
-              <w:t xml:space="preserve">생성형 AI 기반 챗봇 Backend API</w:t>
+              <w:t xml:space="preserve">자사 생성형 AI 플랫폼 PoC</w:t>
             </w:r>
           </w:p>
           <w:p>
@@ -3432,7 +3854,7 @@
                 <w:sz w:val="16"/>
                 <w:szCs w:val="16"/>
               </w:rPr>
-              <w:t xml:space="preserve">생성형 AI 기반 챗봇 서비스 UI/UX 화면</w:t>
+              <w:t xml:space="preserve">자사 도메인 특화 LLM</w:t>
             </w:r>
           </w:p>
           <w:p>
@@ -3474,7 +3896,7 @@
                 <w:sz w:val="16"/>
                 <w:szCs w:val="16"/>
               </w:rPr>
-              <w:t xml:space="preserve">전체 프로젝트 관리 및 일정·리스크·이슈 관리</w:t>
+              <w:t xml:space="preserve">전체 프로젝트 관리 및 WBS 기반 일정·리스크·이슈 관리</w:t>
             </w:r>
           </w:p>
           <w:p>
@@ -3526,7 +3948,7 @@
                 <w:sz w:val="16"/>
                 <w:szCs w:val="16"/>
               </w:rPr>
-              <w:t xml:space="preserve">데이터 전처리 및 데이터마트 구축</w:t>
+              <w:t xml:space="preserve">외부 협력사와의 협업 주도 — 현업부서-협력사 간 의사소통 및 이슈 조율</w:t>
             </w:r>
           </w:p>
           <w:p>
@@ -3552,7 +3974,7 @@
                 <w:sz w:val="16"/>
                 <w:szCs w:val="16"/>
               </w:rPr>
-              <w:t xml:space="preserve">데이터 수집 파이프라인 구축</w:t>
+              <w:t xml:space="preserve">학습데이터 정의 및 생성 관리</w:t>
             </w:r>
           </w:p>
         </w:tc>
@@ -3612,7 +4034,7 @@
                 <w:sz w:val="19"/>
                 <w:szCs w:val="19"/>
               </w:rPr>
-              <w:t xml:space="preserve">3. 경기기업비서 RAG 챗봇 개발  </w:t>
+              <w:t xml:space="preserve">3. 대한전기협회 KEPIC AI 챗봇 구축 PM  </w:t>
             </w:r>
             <w:r>
               <w:rPr>
@@ -3623,7 +4045,7 @@
                 <w:sz w:val="14"/>
                 <w:szCs w:val="14"/>
               </w:rPr>
-              <w:t xml:space="preserve">[AI Engineer]</w:t>
+              <w:t xml:space="preserve">[PM]</w:t>
             </w:r>
           </w:p>
           <w:p>
@@ -3637,7 +4059,7 @@
                 <w:sz w:val="15"/>
                 <w:szCs w:val="15"/>
               </w:rPr>
-              <w:t xml:space="preserve">고객사: 경기도경제과학진흥원  |  2024.05 – 2024.11</w:t>
+              <w:t xml:space="preserve">고객사: 대한전기협회  |  2025.03 – 2025.12</w:t>
             </w:r>
           </w:p>
           <w:p>
@@ -3679,7 +4101,7 @@
                 <w:sz w:val="16"/>
                 <w:szCs w:val="16"/>
               </w:rPr>
-              <w:t xml:space="preserve">경기도 지원사업 공고 추천 RAG 기반 AI 챗봇 구축</w:t>
+              <w:t xml:space="preserve">KEPIC 이용자를 위한 전력산업기술기준(KEPIC) 도메인 특화 AI 챗봇 구축</w:t>
             </w:r>
           </w:p>
           <w:p>
@@ -3721,7 +4143,7 @@
                 <w:sz w:val="16"/>
                 <w:szCs w:val="16"/>
               </w:rPr>
-              <w:t xml:space="preserve">RAG 기반의 지원사업 추천 챗봇 개발 (HyperClovaX + NKS 클라우드)</w:t>
+              <w:t xml:space="preserve">전력산업기술기준(KEPIC) 기반의 도메인 특화 챗봇 개발</w:t>
             </w:r>
           </w:p>
           <w:p>
@@ -3763,11 +4185,63 @@
                 <w:sz w:val="16"/>
                 <w:szCs w:val="16"/>
               </w:rPr>
+              <w:t xml:space="preserve">프로젝트 문서 (WBS, IA, DB 테이블 정의서, 화면설계서, API 설계서 등)</w:t>
+            </w:r>
+          </w:p>
+          <w:p>
+            <w:pPr>
+              <w:spacing w:after="20" w:before="20"/>
+              <w:ind w:left="200"/>
+            </w:pPr>
+            <w:r>
+              <w:rPr>
+                <w:rFonts w:ascii="Malgun Gothic" w:cs="Malgun Gothic" w:eastAsia="Malgun Gothic" w:hAnsi="Malgun Gothic"/>
+                <w:b/>
+                <w:bCs/>
+                <w:color w:val="059669"/>
+                <w:sz w:val="16"/>
+                <w:szCs w:val="16"/>
+              </w:rPr>
+              <w:t xml:space="preserve">2) </w:t>
+            </w:r>
+            <w:r>
+              <w:rPr>
+                <w:rFonts w:ascii="Malgun Gothic" w:cs="Malgun Gothic" w:eastAsia="Malgun Gothic" w:hAnsi="Malgun Gothic"/>
+                <w:color w:val="111827"/>
+                <w:sz w:val="16"/>
+                <w:szCs w:val="16"/>
+              </w:rPr>
               <w:t xml:space="preserve">생성형 AI 기반 챗봇 Backend API</w:t>
             </w:r>
           </w:p>
           <w:p>
             <w:pPr>
+              <w:spacing w:after="20" w:before="20"/>
+              <w:ind w:left="200"/>
+            </w:pPr>
+            <w:r>
+              <w:rPr>
+                <w:rFonts w:ascii="Malgun Gothic" w:cs="Malgun Gothic" w:eastAsia="Malgun Gothic" w:hAnsi="Malgun Gothic"/>
+                <w:b/>
+                <w:bCs/>
+                <w:color w:val="059669"/>
+                <w:sz w:val="16"/>
+                <w:szCs w:val="16"/>
+              </w:rPr>
+              <w:t xml:space="preserve">3) </w:t>
+            </w:r>
+            <w:r>
+              <w:rPr>
+                <w:rFonts w:ascii="Malgun Gothic" w:cs="Malgun Gothic" w:eastAsia="Malgun Gothic" w:hAnsi="Malgun Gothic"/>
+                <w:color w:val="111827"/>
+                <w:sz w:val="16"/>
+                <w:szCs w:val="16"/>
+              </w:rPr>
+              <w:t xml:space="preserve">생성형 AI 기반 챗봇 서비스 UI/UX 화면</w:t>
+            </w:r>
+          </w:p>
+          <w:p>
+            <w:pPr>
               <w:spacing w:after="40" w:before="60"/>
             </w:pPr>
             <w:r>
@@ -3805,7 +4279,7 @@
                 <w:sz w:val="16"/>
                 <w:szCs w:val="16"/>
               </w:rPr>
-              <w:t xml:space="preserve">RAG 챗봇 프롬프트 튜닝 및 개발</w:t>
+              <w:t xml:space="preserve">전체 프로젝트 관리 및 일정·리스크·이슈 관리</w:t>
             </w:r>
           </w:p>
           <w:p>
@@ -3831,6 +4305,32 @@
                 <w:sz w:val="16"/>
                 <w:szCs w:val="16"/>
               </w:rPr>
+              <w:t xml:space="preserve">요구사항 정의, 기능 정의, IA 및 DB 설계</w:t>
+            </w:r>
+          </w:p>
+          <w:p>
+            <w:pPr>
+              <w:spacing w:after="20" w:before="20"/>
+              <w:ind w:left="200"/>
+            </w:pPr>
+            <w:r>
+              <w:rPr>
+                <w:rFonts w:ascii="Malgun Gothic" w:cs="Malgun Gothic" w:eastAsia="Malgun Gothic" w:hAnsi="Malgun Gothic"/>
+                <w:b/>
+                <w:bCs/>
+                <w:color w:val="059669"/>
+                <w:sz w:val="16"/>
+                <w:szCs w:val="16"/>
+              </w:rPr>
+              <w:t xml:space="preserve">3) </w:t>
+            </w:r>
+            <w:r>
+              <w:rPr>
+                <w:rFonts w:ascii="Malgun Gothic" w:cs="Malgun Gothic" w:eastAsia="Malgun Gothic" w:hAnsi="Malgun Gothic"/>
+                <w:color w:val="111827"/>
+                <w:sz w:val="16"/>
+                <w:szCs w:val="16"/>
+              </w:rPr>
               <w:t xml:space="preserve">데이터 전처리 및 데이터마트 구축</w:t>
             </w:r>
           </w:p>
@@ -3848,21 +4348,1145 @@
                 <w:sz w:val="16"/>
                 <w:szCs w:val="16"/>
               </w:rPr>
-              <w:t xml:space="preserve">3) </w:t>
-            </w:r>
-            <w:r>
-              <w:rPr>
-                <w:rFonts w:ascii="Malgun Gothic" w:cs="Malgun Gothic" w:eastAsia="Malgun Gothic" w:hAnsi="Malgun Gothic"/>
-                <w:color w:val="111827"/>
-                <w:sz w:val="16"/>
-                <w:szCs w:val="16"/>
-              </w:rPr>
-              <w:t xml:space="preserve">데이터 수집 파이프라인 구성</w:t>
+              <w:t xml:space="preserve">4) </w:t>
+            </w:r>
+            <w:r>
+              <w:rPr>
+                <w:rFonts w:ascii="Malgun Gothic" w:cs="Malgun Gothic" w:eastAsia="Malgun Gothic" w:hAnsi="Malgun Gothic"/>
+                <w:color w:val="111827"/>
+                <w:sz w:val="16"/>
+                <w:szCs w:val="16"/>
+              </w:rPr>
+              <w:t xml:space="preserve">데이터 수집 파이프라인 구축</w:t>
             </w:r>
           </w:p>
         </w:tc>
       </w:tr>
     </w:tbl>
+    <w:p>
+      <w:pPr>
+        <w:spacing w:after="0" w:before="100"/>
+      </w:pPr>
+      <w:r>
+        <w:rPr>
+          <w:rFonts w:ascii="Malgun Gothic" w:cs="Malgun Gothic" w:eastAsia="Malgun Gothic" w:hAnsi="Malgun Gothic"/>
+        </w:rPr>
+        <w:t xml:space="preserve"/>
+      </w:r>
+    </w:p>
+    <w:tbl>
+      <w:tblPr>
+        <w:tblW w:type="dxa" w:w="9866"/>
+        <w:tblBorders>
+          <w:top w:val="none" w:color="FFFFFF" w:sz="0"/>
+          <w:left w:val="none" w:color="FFFFFF" w:sz="0"/>
+          <w:bottom w:val="none" w:color="FFFFFF" w:sz="0"/>
+          <w:right w:val="none" w:color="FFFFFF" w:sz="0"/>
+          <w:insideH w:val="single" w:color="auto" w:sz="4"/>
+          <w:insideV w:val="single" w:color="auto" w:sz="4"/>
+        </w:tblBorders>
+      </w:tblPr>
+      <w:tblGrid>
+        <w:gridCol w:w="9866"/>
+      </w:tblGrid>
+      <w:tr>
+        <w:tc>
+          <w:tcPr>
+            <w:tcBorders>
+              <w:top w:val="single" w:color="E5E7EB" w:sz="4"/>
+              <w:left w:val="single" w:color="E5E7EB" w:sz="4"/>
+              <w:bottom w:val="single" w:color="E5E7EB" w:sz="4"/>
+              <w:right w:val="single" w:color="E5E7EB" w:sz="4"/>
+            </w:tcBorders>
+            <w:tcMar>
+              <w:top w:type="dxa" w:w="100"/>
+              <w:left w:type="dxa" w:w="140"/>
+              <w:bottom w:type="dxa" w:w="100"/>
+              <w:right w:type="dxa" w:w="140"/>
+            </w:tcMar>
+          </w:tcPr>
+          <w:p>
+            <w:pPr>
+              <w:spacing w:after="40" w:before="0"/>
+            </w:pPr>
+            <w:r>
+              <w:rPr>
+                <w:rFonts w:ascii="Malgun Gothic" w:cs="Malgun Gothic" w:eastAsia="Malgun Gothic" w:hAnsi="Malgun Gothic"/>
+                <w:b/>
+                <w:bCs/>
+                <w:sz w:val="19"/>
+                <w:szCs w:val="19"/>
+              </w:rPr>
+              <w:t xml:space="preserve">4. 경기기업비서 RAG 챗봇 개발  </w:t>
+            </w:r>
+            <w:r>
+              <w:rPr>
+                <w:rFonts w:ascii="Malgun Gothic" w:cs="Malgun Gothic" w:eastAsia="Malgun Gothic" w:hAnsi="Malgun Gothic"/>
+                <w:b/>
+                <w:bCs/>
+                <w:color w:val="047857"/>
+                <w:sz w:val="14"/>
+                <w:szCs w:val="14"/>
+              </w:rPr>
+              <w:t xml:space="preserve">[AI Engineer]</w:t>
+            </w:r>
+          </w:p>
+          <w:p>
+            <w:pPr>
+              <w:spacing w:after="80" w:before="0"/>
+            </w:pPr>
+            <w:r>
+              <w:rPr>
+                <w:rFonts w:ascii="Malgun Gothic" w:cs="Malgun Gothic" w:eastAsia="Malgun Gothic" w:hAnsi="Malgun Gothic"/>
+                <w:color w:val="6B7280"/>
+                <w:sz w:val="15"/>
+                <w:szCs w:val="15"/>
+              </w:rPr>
+              <w:t xml:space="preserve">고객사: 경기도경제과학진흥원  |  2024.05 – 2024.11</w:t>
+            </w:r>
+          </w:p>
+          <w:p>
+            <w:pPr>
+              <w:spacing w:after="40" w:before="60"/>
+            </w:pPr>
+            <w:r>
+              <w:rPr>
+                <w:rFonts w:ascii="Malgun Gothic" w:cs="Malgun Gothic" w:eastAsia="Malgun Gothic" w:hAnsi="Malgun Gothic"/>
+                <w:b/>
+                <w:bCs/>
+                <w:color w:val="059669"/>
+                <w:sz w:val="16"/>
+                <w:szCs w:val="16"/>
+              </w:rPr>
+              <w:t xml:space="preserve">▸ 수행 목적</w:t>
+            </w:r>
+          </w:p>
+          <w:p>
+            <w:pPr>
+              <w:spacing w:after="20" w:before="20"/>
+              <w:ind w:left="200"/>
+            </w:pPr>
+            <w:r>
+              <w:rPr>
+                <w:rFonts w:ascii="Malgun Gothic" w:cs="Malgun Gothic" w:eastAsia="Malgun Gothic" w:hAnsi="Malgun Gothic"/>
+                <w:b/>
+                <w:bCs/>
+                <w:color w:val="059669"/>
+                <w:sz w:val="16"/>
+                <w:szCs w:val="16"/>
+              </w:rPr>
+              <w:t xml:space="preserve">· </w:t>
+            </w:r>
+            <w:r>
+              <w:rPr>
+                <w:rFonts w:ascii="Malgun Gothic" w:cs="Malgun Gothic" w:eastAsia="Malgun Gothic" w:hAnsi="Malgun Gothic"/>
+                <w:color w:val="111827"/>
+                <w:sz w:val="16"/>
+                <w:szCs w:val="16"/>
+              </w:rPr>
+              <w:t xml:space="preserve">경기도 지원사업 공고 추천 RAG 기반 AI 챗봇 구축</w:t>
+            </w:r>
+          </w:p>
+          <w:p>
+            <w:pPr>
+              <w:spacing w:after="40" w:before="60"/>
+            </w:pPr>
+            <w:r>
+              <w:rPr>
+                <w:rFonts w:ascii="Malgun Gothic" w:cs="Malgun Gothic" w:eastAsia="Malgun Gothic" w:hAnsi="Malgun Gothic"/>
+                <w:b/>
+                <w:bCs/>
+                <w:color w:val="059669"/>
+                <w:sz w:val="16"/>
+                <w:szCs w:val="16"/>
+              </w:rPr>
+              <w:t xml:space="preserve">▸ 핵심 과제</w:t>
+            </w:r>
+          </w:p>
+          <w:p>
+            <w:pPr>
+              <w:spacing w:after="20" w:before="20"/>
+              <w:ind w:left="200"/>
+            </w:pPr>
+            <w:r>
+              <w:rPr>
+                <w:rFonts w:ascii="Malgun Gothic" w:cs="Malgun Gothic" w:eastAsia="Malgun Gothic" w:hAnsi="Malgun Gothic"/>
+                <w:b/>
+                <w:bCs/>
+                <w:color w:val="059669"/>
+                <w:sz w:val="16"/>
+                <w:szCs w:val="16"/>
+              </w:rPr>
+              <w:t xml:space="preserve">1) </w:t>
+            </w:r>
+            <w:r>
+              <w:rPr>
+                <w:rFonts w:ascii="Malgun Gothic" w:cs="Malgun Gothic" w:eastAsia="Malgun Gothic" w:hAnsi="Malgun Gothic"/>
+                <w:color w:val="111827"/>
+                <w:sz w:val="16"/>
+                <w:szCs w:val="16"/>
+              </w:rPr>
+              <w:t xml:space="preserve">RAG 기반의 지원사업 추천 챗봇 개발 (HyperClovaX + NKS 클라우드)</w:t>
+            </w:r>
+          </w:p>
+          <w:p>
+            <w:pPr>
+              <w:spacing w:after="40" w:before="60"/>
+            </w:pPr>
+            <w:r>
+              <w:rPr>
+                <w:rFonts w:ascii="Malgun Gothic" w:cs="Malgun Gothic" w:eastAsia="Malgun Gothic" w:hAnsi="Malgun Gothic"/>
+                <w:b/>
+                <w:bCs/>
+                <w:color w:val="059669"/>
+                <w:sz w:val="16"/>
+                <w:szCs w:val="16"/>
+              </w:rPr>
+              <w:t xml:space="preserve">▸ 프로젝트 산출물</w:t>
+            </w:r>
+          </w:p>
+          <w:p>
+            <w:pPr>
+              <w:spacing w:after="20" w:before="20"/>
+              <w:ind w:left="200"/>
+            </w:pPr>
+            <w:r>
+              <w:rPr>
+                <w:rFonts w:ascii="Malgun Gothic" w:cs="Malgun Gothic" w:eastAsia="Malgun Gothic" w:hAnsi="Malgun Gothic"/>
+                <w:b/>
+                <w:bCs/>
+                <w:color w:val="059669"/>
+                <w:sz w:val="16"/>
+                <w:szCs w:val="16"/>
+              </w:rPr>
+              <w:t xml:space="preserve">1) </w:t>
+            </w:r>
+            <w:r>
+              <w:rPr>
+                <w:rFonts w:ascii="Malgun Gothic" w:cs="Malgun Gothic" w:eastAsia="Malgun Gothic" w:hAnsi="Malgun Gothic"/>
+                <w:color w:val="111827"/>
+                <w:sz w:val="16"/>
+                <w:szCs w:val="16"/>
+              </w:rPr>
+              <w:t xml:space="preserve">생성형 AI 기반 챗봇 Backend API</w:t>
+            </w:r>
+          </w:p>
+          <w:p>
+            <w:pPr>
+              <w:spacing w:after="40" w:before="60"/>
+            </w:pPr>
+            <w:r>
+              <w:rPr>
+                <w:rFonts w:ascii="Malgun Gothic" w:cs="Malgun Gothic" w:eastAsia="Malgun Gothic" w:hAnsi="Malgun Gothic"/>
+                <w:b/>
+                <w:bCs/>
+                <w:color w:val="059669"/>
+                <w:sz w:val="16"/>
+                <w:szCs w:val="16"/>
+              </w:rPr>
+              <w:t xml:space="preserve">▸ 본인의 역할</w:t>
+            </w:r>
+          </w:p>
+          <w:p>
+            <w:pPr>
+              <w:spacing w:after="20" w:before="20"/>
+              <w:ind w:left="200"/>
+            </w:pPr>
+            <w:r>
+              <w:rPr>
+                <w:rFonts w:ascii="Malgun Gothic" w:cs="Malgun Gothic" w:eastAsia="Malgun Gothic" w:hAnsi="Malgun Gothic"/>
+                <w:b/>
+                <w:bCs/>
+                <w:color w:val="059669"/>
+                <w:sz w:val="16"/>
+                <w:szCs w:val="16"/>
+              </w:rPr>
+              <w:t xml:space="preserve">1) </w:t>
+            </w:r>
+            <w:r>
+              <w:rPr>
+                <w:rFonts w:ascii="Malgun Gothic" w:cs="Malgun Gothic" w:eastAsia="Malgun Gothic" w:hAnsi="Malgun Gothic"/>
+                <w:color w:val="111827"/>
+                <w:sz w:val="16"/>
+                <w:szCs w:val="16"/>
+              </w:rPr>
+              <w:t xml:space="preserve">RAG 챗봇 프롬프트 튜닝 및 개발</w:t>
+            </w:r>
+          </w:p>
+          <w:p>
+            <w:pPr>
+              <w:spacing w:after="20" w:before="20"/>
+              <w:ind w:left="200"/>
+            </w:pPr>
+            <w:r>
+              <w:rPr>
+                <w:rFonts w:ascii="Malgun Gothic" w:cs="Malgun Gothic" w:eastAsia="Malgun Gothic" w:hAnsi="Malgun Gothic"/>
+                <w:b/>
+                <w:bCs/>
+                <w:color w:val="059669"/>
+                <w:sz w:val="16"/>
+                <w:szCs w:val="16"/>
+              </w:rPr>
+              <w:t xml:space="preserve">2) </w:t>
+            </w:r>
+            <w:r>
+              <w:rPr>
+                <w:rFonts w:ascii="Malgun Gothic" w:cs="Malgun Gothic" w:eastAsia="Malgun Gothic" w:hAnsi="Malgun Gothic"/>
+                <w:color w:val="111827"/>
+                <w:sz w:val="16"/>
+                <w:szCs w:val="16"/>
+              </w:rPr>
+              <w:t xml:space="preserve">데이터 전처리 및 데이터마트 구축</w:t>
+            </w:r>
+          </w:p>
+          <w:p>
+            <w:pPr>
+              <w:spacing w:after="20" w:before="20"/>
+              <w:ind w:left="200"/>
+            </w:pPr>
+            <w:r>
+              <w:rPr>
+                <w:rFonts w:ascii="Malgun Gothic" w:cs="Malgun Gothic" w:eastAsia="Malgun Gothic" w:hAnsi="Malgun Gothic"/>
+                <w:b/>
+                <w:bCs/>
+                <w:color w:val="059669"/>
+                <w:sz w:val="16"/>
+                <w:szCs w:val="16"/>
+              </w:rPr>
+              <w:t xml:space="preserve">3) </w:t>
+            </w:r>
+            <w:r>
+              <w:rPr>
+                <w:rFonts w:ascii="Malgun Gothic" w:cs="Malgun Gothic" w:eastAsia="Malgun Gothic" w:hAnsi="Malgun Gothic"/>
+                <w:color w:val="111827"/>
+                <w:sz w:val="16"/>
+                <w:szCs w:val="16"/>
+              </w:rPr>
+              <w:t xml:space="preserve">데이터 수집 파이프라인 구성</w:t>
+            </w:r>
+          </w:p>
+        </w:tc>
+      </w:tr>
+    </w:tbl>
+    <w:p>
+      <w:pPr>
+        <w:spacing w:after="0" w:before="100"/>
+      </w:pPr>
+      <w:r>
+        <w:rPr>
+          <w:rFonts w:ascii="Malgun Gothic" w:cs="Malgun Gothic" w:eastAsia="Malgun Gothic" w:hAnsi="Malgun Gothic"/>
+        </w:rPr>
+        <w:t xml:space="preserve"/>
+      </w:r>
+    </w:p>
+    <w:tbl>
+      <w:tblPr>
+        <w:tblW w:type="dxa" w:w="9866"/>
+        <w:tblBorders>
+          <w:top w:val="none" w:color="FFFFFF" w:sz="0"/>
+          <w:left w:val="none" w:color="FFFFFF" w:sz="0"/>
+          <w:bottom w:val="none" w:color="FFFFFF" w:sz="0"/>
+          <w:right w:val="none" w:color="FFFFFF" w:sz="0"/>
+          <w:insideH w:val="single" w:color="auto" w:sz="4"/>
+          <w:insideV w:val="single" w:color="auto" w:sz="4"/>
+        </w:tblBorders>
+      </w:tblPr>
+      <w:tblGrid>
+        <w:gridCol w:w="9866"/>
+      </w:tblGrid>
+      <w:tr>
+        <w:tc>
+          <w:tcPr>
+            <w:tcBorders>
+              <w:top w:val="single" w:color="E5E7EB" w:sz="4"/>
+              <w:left w:val="single" w:color="E5E7EB" w:sz="4"/>
+              <w:bottom w:val="single" w:color="E5E7EB" w:sz="4"/>
+              <w:right w:val="single" w:color="E5E7EB" w:sz="4"/>
+            </w:tcBorders>
+            <w:tcMar>
+              <w:top w:type="dxa" w:w="100"/>
+              <w:left w:type="dxa" w:w="140"/>
+              <w:bottom w:type="dxa" w:w="100"/>
+              <w:right w:type="dxa" w:w="140"/>
+            </w:tcMar>
+          </w:tcPr>
+          <w:p>
+            <w:pPr>
+              <w:spacing w:after="40" w:before="0"/>
+            </w:pPr>
+            <w:r>
+              <w:rPr>
+                <w:rFonts w:ascii="Malgun Gothic" w:cs="Malgun Gothic" w:eastAsia="Malgun Gothic" w:hAnsi="Malgun Gothic"/>
+                <w:b/>
+                <w:bCs/>
+                <w:sz w:val="19"/>
+                <w:szCs w:val="19"/>
+              </w:rPr>
+              <w:t xml:space="preserve">5. 나라장터 AI 공고 모니터링 시스템  </w:t>
+            </w:r>
+            <w:r>
+              <w:rPr>
+                <w:rFonts w:ascii="Malgun Gothic" w:cs="Malgun Gothic" w:eastAsia="Malgun Gothic" w:hAnsi="Malgun Gothic"/>
+                <w:b/>
+                <w:bCs/>
+                <w:color w:val="047857"/>
+                <w:sz w:val="14"/>
+                <w:szCs w:val="14"/>
+              </w:rPr>
+              <w:t xml:space="preserve">[기획 · 개발]</w:t>
+            </w:r>
+          </w:p>
+          <w:p>
+            <w:pPr>
+              <w:spacing w:after="80" w:before="0"/>
+            </w:pPr>
+            <w:r>
+              <w:rPr>
+                <w:rFonts w:ascii="Malgun Gothic" w:cs="Malgun Gothic" w:eastAsia="Malgun Gothic" w:hAnsi="Malgun Gothic"/>
+                <w:color w:val="6B7280"/>
+                <w:sz w:val="15"/>
+                <w:szCs w:val="15"/>
+              </w:rPr>
+              <w:t xml:space="preserve">사내 프로젝트 (㈜클라비)  |  2026.05 – 현재 (운영 중)</w:t>
+            </w:r>
+          </w:p>
+          <w:p>
+            <w:pPr>
+              <w:spacing w:after="40" w:before="60"/>
+            </w:pPr>
+            <w:r>
+              <w:rPr>
+                <w:rFonts w:ascii="Malgun Gothic" w:cs="Malgun Gothic" w:eastAsia="Malgun Gothic" w:hAnsi="Malgun Gothic"/>
+                <w:b/>
+                <w:bCs/>
+                <w:color w:val="059669"/>
+                <w:sz w:val="16"/>
+                <w:szCs w:val="16"/>
+              </w:rPr>
+              <w:t xml:space="preserve">▸ 수행 목적</w:t>
+            </w:r>
+          </w:p>
+          <w:p>
+            <w:pPr>
+              <w:spacing w:after="20" w:before="20"/>
+              <w:ind w:left="200"/>
+            </w:pPr>
+            <w:r>
+              <w:rPr>
+                <w:rFonts w:ascii="Malgun Gothic" w:cs="Malgun Gothic" w:eastAsia="Malgun Gothic" w:hAnsi="Malgun Gothic"/>
+                <w:b/>
+                <w:bCs/>
+                <w:color w:val="059669"/>
+                <w:sz w:val="16"/>
+                <w:szCs w:val="16"/>
+              </w:rPr>
+              <w:t xml:space="preserve">· </w:t>
+            </w:r>
+            <w:r>
+              <w:rPr>
+                <w:rFonts w:ascii="Malgun Gothic" w:cs="Malgun Gothic" w:eastAsia="Malgun Gothic" w:hAnsi="Malgun Gothic"/>
+                <w:color w:val="111827"/>
+                <w:sz w:val="16"/>
+                <w:szCs w:val="16"/>
+              </w:rPr>
+              <w:t xml:space="preserve">나라장터 공공조달 공고를 매일 자동 수집·분석하여 영업 조직의 사업 발굴 및 입찰 검토 업무 효율화</w:t>
+            </w:r>
+          </w:p>
+          <w:p>
+            <w:pPr>
+              <w:spacing w:after="40" w:before="60"/>
+            </w:pPr>
+            <w:r>
+              <w:rPr>
+                <w:rFonts w:ascii="Malgun Gothic" w:cs="Malgun Gothic" w:eastAsia="Malgun Gothic" w:hAnsi="Malgun Gothic"/>
+                <w:b/>
+                <w:bCs/>
+                <w:color w:val="059669"/>
+                <w:sz w:val="16"/>
+                <w:szCs w:val="16"/>
+              </w:rPr>
+              <w:t xml:space="preserve">▸ 핵심 과제</w:t>
+            </w:r>
+          </w:p>
+          <w:p>
+            <w:pPr>
+              <w:spacing w:after="20" w:before="20"/>
+              <w:ind w:left="200"/>
+            </w:pPr>
+            <w:r>
+              <w:rPr>
+                <w:rFonts w:ascii="Malgun Gothic" w:cs="Malgun Gothic" w:eastAsia="Malgun Gothic" w:hAnsi="Malgun Gothic"/>
+                <w:b/>
+                <w:bCs/>
+                <w:color w:val="059669"/>
+                <w:sz w:val="16"/>
+                <w:szCs w:val="16"/>
+              </w:rPr>
+              <w:t xml:space="preserve">1) </w:t>
+            </w:r>
+            <w:r>
+              <w:rPr>
+                <w:rFonts w:ascii="Malgun Gothic" w:cs="Malgun Gothic" w:eastAsia="Malgun Gothic" w:hAnsi="Malgun Gothic"/>
+                <w:color w:val="111827"/>
+                <w:sz w:val="16"/>
+                <w:szCs w:val="16"/>
+              </w:rPr>
+              <w:t xml:space="preserve">입찰공고·사전규격·발주계획 3개 유형 공고 매일 자동 수집 (조달청 공공데이터 API)</w:t>
+            </w:r>
+          </w:p>
+          <w:p>
+            <w:pPr>
+              <w:spacing w:after="20" w:before="20"/>
+              <w:ind w:left="200"/>
+            </w:pPr>
+            <w:r>
+              <w:rPr>
+                <w:rFonts w:ascii="Malgun Gothic" w:cs="Malgun Gothic" w:eastAsia="Malgun Gothic" w:hAnsi="Malgun Gothic"/>
+                <w:b/>
+                <w:bCs/>
+                <w:color w:val="059669"/>
+                <w:sz w:val="16"/>
+                <w:szCs w:val="16"/>
+              </w:rPr>
+              <w:t xml:space="preserve">2) </w:t>
+            </w:r>
+            <w:r>
+              <w:rPr>
+                <w:rFonts w:ascii="Malgun Gothic" w:cs="Malgun Gothic" w:eastAsia="Malgun Gothic" w:hAnsi="Malgun Gothic"/>
+                <w:color w:val="111827"/>
+                <w:sz w:val="16"/>
+                <w:szCs w:val="16"/>
+              </w:rPr>
+              <w:t xml:space="preserve">LLM 2단계 분석 — 제목·메타 기반 1차 스크리닝 후 첨부 RFP(PDF/HWP) 본문을 읽어 자사 역량 적합도 심층 평가</w:t>
+            </w:r>
+          </w:p>
+          <w:p>
+            <w:pPr>
+              <w:spacing w:after="20" w:before="20"/>
+              <w:ind w:left="200"/>
+            </w:pPr>
+            <w:r>
+              <w:rPr>
+                <w:rFonts w:ascii="Malgun Gothic" w:cs="Malgun Gothic" w:eastAsia="Malgun Gothic" w:hAnsi="Malgun Gothic"/>
+                <w:b/>
+                <w:bCs/>
+                <w:color w:val="059669"/>
+                <w:sz w:val="16"/>
+                <w:szCs w:val="16"/>
+              </w:rPr>
+              <w:t xml:space="preserve">3) </w:t>
+            </w:r>
+            <w:r>
+              <w:rPr>
+                <w:rFonts w:ascii="Malgun Gothic" w:cs="Malgun Gothic" w:eastAsia="Malgun Gothic" w:hAnsi="Malgun Gothic"/>
+                <w:color w:val="111827"/>
+                <w:sz w:val="16"/>
+                <w:szCs w:val="16"/>
+              </w:rPr>
+              <w:t xml:space="preserve">즉시검토·검토고려 분류, 강점/리스크·권장 행동을 담은 HTML 메일 및 엑셀 리포트 자동 발송</w:t>
+            </w:r>
+          </w:p>
+          <w:p>
+            <w:pPr>
+              <w:spacing w:after="20" w:before="20"/>
+              <w:ind w:left="200"/>
+            </w:pPr>
+            <w:r>
+              <w:rPr>
+                <w:rFonts w:ascii="Malgun Gothic" w:cs="Malgun Gothic" w:eastAsia="Malgun Gothic" w:hAnsi="Malgun Gothic"/>
+                <w:b/>
+                <w:bCs/>
+                <w:color w:val="059669"/>
+                <w:sz w:val="16"/>
+                <w:szCs w:val="16"/>
+              </w:rPr>
+              <w:t xml:space="preserve">4) </w:t>
+            </w:r>
+            <w:r>
+              <w:rPr>
+                <w:rFonts w:ascii="Malgun Gothic" w:cs="Malgun Gothic" w:eastAsia="Malgun Gothic" w:hAnsi="Malgun Gothic"/>
+                <w:color w:val="111827"/>
+                <w:sz w:val="16"/>
+                <w:szCs w:val="16"/>
+              </w:rPr>
+              <w:t xml:space="preserve">해외 IP 다운로드 차단 대응을 위한 서울 리전 파일 다운로드 프록시 구축</w:t>
+            </w:r>
+          </w:p>
+          <w:p>
+            <w:pPr>
+              <w:spacing w:after="40" w:before="60"/>
+            </w:pPr>
+            <w:r>
+              <w:rPr>
+                <w:rFonts w:ascii="Malgun Gothic" w:cs="Malgun Gothic" w:eastAsia="Malgun Gothic" w:hAnsi="Malgun Gothic"/>
+                <w:b/>
+                <w:bCs/>
+                <w:color w:val="059669"/>
+                <w:sz w:val="16"/>
+                <w:szCs w:val="16"/>
+              </w:rPr>
+              <w:t xml:space="preserve">▸ 프로젝트 산출물</w:t>
+            </w:r>
+          </w:p>
+          <w:p>
+            <w:pPr>
+              <w:spacing w:after="20" w:before="20"/>
+              <w:ind w:left="200"/>
+            </w:pPr>
+            <w:r>
+              <w:rPr>
+                <w:rFonts w:ascii="Malgun Gothic" w:cs="Malgun Gothic" w:eastAsia="Malgun Gothic" w:hAnsi="Malgun Gothic"/>
+                <w:b/>
+                <w:bCs/>
+                <w:color w:val="059669"/>
+                <w:sz w:val="16"/>
+                <w:szCs w:val="16"/>
+              </w:rPr>
+              <w:t xml:space="preserve">1) </w:t>
+            </w:r>
+            <w:r>
+              <w:rPr>
+                <w:rFonts w:ascii="Malgun Gothic" w:cs="Malgun Gothic" w:eastAsia="Malgun Gothic" w:hAnsi="Malgun Gothic"/>
+                <w:color w:val="111827"/>
+                <w:sz w:val="16"/>
+                <w:szCs w:val="16"/>
+              </w:rPr>
+              <w:t xml:space="preserve">GitHub Actions 기반 일일 자동 실행 파이프라인 (매일 07:00)</w:t>
+            </w:r>
+          </w:p>
+          <w:p>
+            <w:pPr>
+              <w:spacing w:after="20" w:before="20"/>
+              <w:ind w:left="200"/>
+            </w:pPr>
+            <w:r>
+              <w:rPr>
+                <w:rFonts w:ascii="Malgun Gothic" w:cs="Malgun Gothic" w:eastAsia="Malgun Gothic" w:hAnsi="Malgun Gothic"/>
+                <w:b/>
+                <w:bCs/>
+                <w:color w:val="059669"/>
+                <w:sz w:val="16"/>
+                <w:szCs w:val="16"/>
+              </w:rPr>
+              <w:t xml:space="preserve">2) </w:t>
+            </w:r>
+            <w:r>
+              <w:rPr>
+                <w:rFonts w:ascii="Malgun Gothic" w:cs="Malgun Gothic" w:eastAsia="Malgun Gothic" w:hAnsi="Malgun Gothic"/>
+                <w:color w:val="111827"/>
+                <w:sz w:val="16"/>
+                <w:szCs w:val="16"/>
+              </w:rPr>
+              <w:t xml:space="preserve">영업 조직별 키워드·수신자를 분리 운영하는 멀티 고객 구조 및 등록 도구 (CLI/GUI)</w:t>
+            </w:r>
+          </w:p>
+          <w:p>
+            <w:pPr>
+              <w:spacing w:after="40" w:before="60"/>
+            </w:pPr>
+            <w:r>
+              <w:rPr>
+                <w:rFonts w:ascii="Malgun Gothic" w:cs="Malgun Gothic" w:eastAsia="Malgun Gothic" w:hAnsi="Malgun Gothic"/>
+                <w:b/>
+                <w:bCs/>
+                <w:color w:val="059669"/>
+                <w:sz w:val="16"/>
+                <w:szCs w:val="16"/>
+              </w:rPr>
+              <w:t xml:space="preserve">▸ 본인의 역할</w:t>
+            </w:r>
+          </w:p>
+          <w:p>
+            <w:pPr>
+              <w:spacing w:after="20" w:before="20"/>
+              <w:ind w:left="200"/>
+            </w:pPr>
+            <w:r>
+              <w:rPr>
+                <w:rFonts w:ascii="Malgun Gothic" w:cs="Malgun Gothic" w:eastAsia="Malgun Gothic" w:hAnsi="Malgun Gothic"/>
+                <w:b/>
+                <w:bCs/>
+                <w:color w:val="059669"/>
+                <w:sz w:val="16"/>
+                <w:szCs w:val="16"/>
+              </w:rPr>
+              <w:t xml:space="preserve">1) </w:t>
+            </w:r>
+            <w:r>
+              <w:rPr>
+                <w:rFonts w:ascii="Malgun Gothic" w:cs="Malgun Gothic" w:eastAsia="Malgun Gothic" w:hAnsi="Malgun Gothic"/>
+                <w:color w:val="111827"/>
+                <w:sz w:val="16"/>
+                <w:szCs w:val="16"/>
+              </w:rPr>
+              <w:t xml:space="preserve">기획, 설계, 개발, 운영 전 과정 1인 수행</w:t>
+            </w:r>
+          </w:p>
+          <w:p>
+            <w:pPr>
+              <w:spacing w:after="20" w:before="20"/>
+              <w:ind w:left="200"/>
+            </w:pPr>
+            <w:r>
+              <w:rPr>
+                <w:rFonts w:ascii="Malgun Gothic" w:cs="Malgun Gothic" w:eastAsia="Malgun Gothic" w:hAnsi="Malgun Gothic"/>
+                <w:b/>
+                <w:bCs/>
+                <w:color w:val="059669"/>
+                <w:sz w:val="16"/>
+                <w:szCs w:val="16"/>
+              </w:rPr>
+              <w:t xml:space="preserve">2) </w:t>
+            </w:r>
+            <w:r>
+              <w:rPr>
+                <w:rFonts w:ascii="Malgun Gothic" w:cs="Malgun Gothic" w:eastAsia="Malgun Gothic" w:hAnsi="Malgun Gothic"/>
+                <w:color w:val="111827"/>
+                <w:sz w:val="16"/>
+                <w:szCs w:val="16"/>
+              </w:rPr>
+              <w:t xml:space="preserve">Python · OpenAI API · GitHub Actions · Vercel</w:t>
+            </w:r>
+          </w:p>
+        </w:tc>
+      </w:tr>
+    </w:tbl>
+    <w:p>
+      <w:pPr>
+        <w:spacing w:after="0" w:before="100"/>
+      </w:pPr>
+      <w:r>
+        <w:rPr>
+          <w:rFonts w:ascii="Malgun Gothic" w:cs="Malgun Gothic" w:eastAsia="Malgun Gothic" w:hAnsi="Malgun Gothic"/>
+        </w:rPr>
+        <w:t xml:space="preserve"/>
+      </w:r>
+    </w:p>
+    <w:tbl>
+      <w:tblPr>
+        <w:tblW w:type="dxa" w:w="9866"/>
+        <w:tblBorders>
+          <w:top w:val="none" w:color="FFFFFF" w:sz="0"/>
+          <w:left w:val="none" w:color="FFFFFF" w:sz="0"/>
+          <w:bottom w:val="none" w:color="FFFFFF" w:sz="0"/>
+          <w:right w:val="none" w:color="FFFFFF" w:sz="0"/>
+          <w:insideH w:val="single" w:color="auto" w:sz="4"/>
+          <w:insideV w:val="single" w:color="auto" w:sz="4"/>
+        </w:tblBorders>
+      </w:tblPr>
+      <w:tblGrid>
+        <w:gridCol w:w="9866"/>
+      </w:tblGrid>
+      <w:tr>
+        <w:tc>
+          <w:tcPr>
+            <w:tcBorders>
+              <w:top w:val="single" w:color="E5E7EB" w:sz="4"/>
+              <w:left w:val="single" w:color="E5E7EB" w:sz="4"/>
+              <w:bottom w:val="single" w:color="E5E7EB" w:sz="4"/>
+              <w:right w:val="single" w:color="E5E7EB" w:sz="4"/>
+            </w:tcBorders>
+            <w:tcMar>
+              <w:top w:type="dxa" w:w="100"/>
+              <w:left w:type="dxa" w:w="140"/>
+              <w:bottom w:type="dxa" w:w="100"/>
+              <w:right w:type="dxa" w:w="140"/>
+            </w:tcMar>
+          </w:tcPr>
+          <w:p>
+            <w:pPr>
+              <w:spacing w:after="40" w:before="0"/>
+            </w:pPr>
+            <w:r>
+              <w:rPr>
+                <w:rFonts w:ascii="Malgun Gothic" w:cs="Malgun Gothic" w:eastAsia="Malgun Gothic" w:hAnsi="Malgun Gothic"/>
+                <w:b/>
+                <w:bCs/>
+                <w:sz w:val="19"/>
+                <w:szCs w:val="19"/>
+              </w:rPr>
+              <w:t xml:space="preserve">6. RFP 제안서 작성 지원 도구  </w:t>
+            </w:r>
+            <w:r>
+              <w:rPr>
+                <w:rFonts w:ascii="Malgun Gothic" w:cs="Malgun Gothic" w:eastAsia="Malgun Gothic" w:hAnsi="Malgun Gothic"/>
+                <w:b/>
+                <w:bCs/>
+                <w:color w:val="047857"/>
+                <w:sz w:val="14"/>
+                <w:szCs w:val="14"/>
+              </w:rPr>
+              <w:t xml:space="preserve">[기획 · 개발]</w:t>
+            </w:r>
+          </w:p>
+          <w:p>
+            <w:pPr>
+              <w:spacing w:after="80" w:before="0"/>
+            </w:pPr>
+            <w:r>
+              <w:rPr>
+                <w:rFonts w:ascii="Malgun Gothic" w:cs="Malgun Gothic" w:eastAsia="Malgun Gothic" w:hAnsi="Malgun Gothic"/>
+                <w:color w:val="6B7280"/>
+                <w:sz w:val="15"/>
+                <w:szCs w:val="15"/>
+              </w:rPr>
+              <w:t xml:space="preserve">사내 프로젝트 (㈜클라비)  |  2026.05 – 2026.06</w:t>
+            </w:r>
+          </w:p>
+          <w:p>
+            <w:pPr>
+              <w:spacing w:after="40" w:before="60"/>
+            </w:pPr>
+            <w:r>
+              <w:rPr>
+                <w:rFonts w:ascii="Malgun Gothic" w:cs="Malgun Gothic" w:eastAsia="Malgun Gothic" w:hAnsi="Malgun Gothic"/>
+                <w:b/>
+                <w:bCs/>
+                <w:color w:val="059669"/>
+                <w:sz w:val="16"/>
+                <w:szCs w:val="16"/>
+              </w:rPr>
+              <w:t xml:space="preserve">▸ 수행 목적</w:t>
+            </w:r>
+          </w:p>
+          <w:p>
+            <w:pPr>
+              <w:spacing w:after="20" w:before="20"/>
+              <w:ind w:left="200"/>
+            </w:pPr>
+            <w:r>
+              <w:rPr>
+                <w:rFonts w:ascii="Malgun Gothic" w:cs="Malgun Gothic" w:eastAsia="Malgun Gothic" w:hAnsi="Malgun Gothic"/>
+                <w:b/>
+                <w:bCs/>
+                <w:color w:val="059669"/>
+                <w:sz w:val="16"/>
+                <w:szCs w:val="16"/>
+              </w:rPr>
+              <w:t xml:space="preserve">· </w:t>
+            </w:r>
+            <w:r>
+              <w:rPr>
+                <w:rFonts w:ascii="Malgun Gothic" w:cs="Malgun Gothic" w:eastAsia="Malgun Gothic" w:hAnsi="Malgun Gothic"/>
+                <w:color w:val="111827"/>
+                <w:sz w:val="16"/>
+                <w:szCs w:val="16"/>
+              </w:rPr>
+              <w:t xml:space="preserve">공공 RFP 분석부터 제안 전략 수립, 장표별 초안 작성까지 제안서 작성 과정 자동화</w:t>
+            </w:r>
+          </w:p>
+          <w:p>
+            <w:pPr>
+              <w:spacing w:after="40" w:before="60"/>
+            </w:pPr>
+            <w:r>
+              <w:rPr>
+                <w:rFonts w:ascii="Malgun Gothic" w:cs="Malgun Gothic" w:eastAsia="Malgun Gothic" w:hAnsi="Malgun Gothic"/>
+                <w:b/>
+                <w:bCs/>
+                <w:color w:val="059669"/>
+                <w:sz w:val="16"/>
+                <w:szCs w:val="16"/>
+              </w:rPr>
+              <w:t xml:space="preserve">▸ 핵심 과제</w:t>
+            </w:r>
+          </w:p>
+          <w:p>
+            <w:pPr>
+              <w:spacing w:after="20" w:before="20"/>
+              <w:ind w:left="200"/>
+            </w:pPr>
+            <w:r>
+              <w:rPr>
+                <w:rFonts w:ascii="Malgun Gothic" w:cs="Malgun Gothic" w:eastAsia="Malgun Gothic" w:hAnsi="Malgun Gothic"/>
+                <w:b/>
+                <w:bCs/>
+                <w:color w:val="059669"/>
+                <w:sz w:val="16"/>
+                <w:szCs w:val="16"/>
+              </w:rPr>
+              <w:t xml:space="preserve">1) </w:t>
+            </w:r>
+            <w:r>
+              <w:rPr>
+                <w:rFonts w:ascii="Malgun Gothic" w:cs="Malgun Gothic" w:eastAsia="Malgun Gothic" w:hAnsi="Malgun Gothic"/>
+                <w:color w:val="111827"/>
+                <w:sz w:val="16"/>
+                <w:szCs w:val="16"/>
+              </w:rPr>
+              <w:t xml:space="preserve">RFP PDF에서 요구사항·목차 자동 추출 (표·도표가 많은 페이지는 Vision LLM으로 OCR)</w:t>
+            </w:r>
+          </w:p>
+          <w:p>
+            <w:pPr>
+              <w:spacing w:after="20" w:before="20"/>
+              <w:ind w:left="200"/>
+            </w:pPr>
+            <w:r>
+              <w:rPr>
+                <w:rFonts w:ascii="Malgun Gothic" w:cs="Malgun Gothic" w:eastAsia="Malgun Gothic" w:hAnsi="Malgun Gothic"/>
+                <w:b/>
+                <w:bCs/>
+                <w:color w:val="059669"/>
+                <w:sz w:val="16"/>
+                <w:szCs w:val="16"/>
+              </w:rPr>
+              <w:t xml:space="preserve">2) </w:t>
+            </w:r>
+            <w:r>
+              <w:rPr>
+                <w:rFonts w:ascii="Malgun Gothic" w:cs="Malgun Gothic" w:eastAsia="Malgun Gothic" w:hAnsi="Malgun Gothic"/>
+                <w:color w:val="111827"/>
+                <w:sz w:val="16"/>
+                <w:szCs w:val="16"/>
+              </w:rPr>
+              <w:t xml:space="preserve">전략가↔비평가 멀티 에이전트 다중 라운드 토론으로 평가위원 관점의 챕터별 전략 수립</w:t>
+            </w:r>
+          </w:p>
+          <w:p>
+            <w:pPr>
+              <w:spacing w:after="20" w:before="20"/>
+              <w:ind w:left="200"/>
+            </w:pPr>
+            <w:r>
+              <w:rPr>
+                <w:rFonts w:ascii="Malgun Gothic" w:cs="Malgun Gothic" w:eastAsia="Malgun Gothic" w:hAnsi="Malgun Gothic"/>
+                <w:b/>
+                <w:bCs/>
+                <w:color w:val="059669"/>
+                <w:sz w:val="16"/>
+                <w:szCs w:val="16"/>
+              </w:rPr>
+              <w:t xml:space="preserve">3) </w:t>
+            </w:r>
+            <w:r>
+              <w:rPr>
+                <w:rFonts w:ascii="Malgun Gothic" w:cs="Malgun Gothic" w:eastAsia="Malgun Gothic" w:hAnsi="Malgun Gothic"/>
+                <w:color w:val="111827"/>
+                <w:sz w:val="16"/>
+                <w:szCs w:val="16"/>
+              </w:rPr>
+              <w:t xml:space="preserve">소제목 단위 병렬 호출로 장표별 초안 생성 · 회사소개서·이전 제안서 등 참고문서 자동 반영</w:t>
+            </w:r>
+          </w:p>
+          <w:p>
+            <w:pPr>
+              <w:spacing w:after="40" w:before="60"/>
+            </w:pPr>
+            <w:r>
+              <w:rPr>
+                <w:rFonts w:ascii="Malgun Gothic" w:cs="Malgun Gothic" w:eastAsia="Malgun Gothic" w:hAnsi="Malgun Gothic"/>
+                <w:b/>
+                <w:bCs/>
+                <w:color w:val="059669"/>
+                <w:sz w:val="16"/>
+                <w:szCs w:val="16"/>
+              </w:rPr>
+              <w:t xml:space="preserve">▸ 프로젝트 산출물</w:t>
+            </w:r>
+          </w:p>
+          <w:p>
+            <w:pPr>
+              <w:spacing w:after="20" w:before="20"/>
+              <w:ind w:left="200"/>
+            </w:pPr>
+            <w:r>
+              <w:rPr>
+                <w:rFonts w:ascii="Malgun Gothic" w:cs="Malgun Gothic" w:eastAsia="Malgun Gothic" w:hAnsi="Malgun Gothic"/>
+                <w:b/>
+                <w:bCs/>
+                <w:color w:val="059669"/>
+                <w:sz w:val="16"/>
+                <w:szCs w:val="16"/>
+              </w:rPr>
+              <w:t xml:space="preserve">1) </w:t>
+            </w:r>
+            <w:r>
+              <w:rPr>
+                <w:rFonts w:ascii="Malgun Gothic" w:cs="Malgun Gothic" w:eastAsia="Malgun Gothic" w:hAnsi="Malgun Gothic"/>
+                <w:color w:val="111827"/>
+                <w:sz w:val="16"/>
+                <w:szCs w:val="16"/>
+              </w:rPr>
+              <w:t xml:space="preserve">Streamlit 기반 제안서 작성 웹 도구 (목차 편집, 요구사항 매핑, 엑셀·마크다운 export)</w:t>
+            </w:r>
+          </w:p>
+          <w:p>
+            <w:pPr>
+              <w:spacing w:after="20" w:before="20"/>
+              <w:ind w:left="200"/>
+            </w:pPr>
+            <w:r>
+              <w:rPr>
+                <w:rFonts w:ascii="Malgun Gothic" w:cs="Malgun Gothic" w:eastAsia="Malgun Gothic" w:hAnsi="Malgun Gothic"/>
+                <w:b/>
+                <w:bCs/>
+                <w:color w:val="059669"/>
+                <w:sz w:val="16"/>
+                <w:szCs w:val="16"/>
+              </w:rPr>
+              <w:t xml:space="preserve">2) </w:t>
+            </w:r>
+            <w:r>
+              <w:rPr>
+                <w:rFonts w:ascii="Malgun Gothic" w:cs="Malgun Gothic" w:eastAsia="Malgun Gothic" w:hAnsi="Malgun Gothic"/>
+                <w:color w:val="111827"/>
+                <w:sz w:val="16"/>
+                <w:szCs w:val="16"/>
+              </w:rPr>
+              <w:t xml:space="preserve">비개발자용 원클릭 실행 패키지 (Python 환경 자동 설치)</w:t>
+            </w:r>
+          </w:p>
+          <w:p>
+            <w:pPr>
+              <w:spacing w:after="40" w:before="60"/>
+            </w:pPr>
+            <w:r>
+              <w:rPr>
+                <w:rFonts w:ascii="Malgun Gothic" w:cs="Malgun Gothic" w:eastAsia="Malgun Gothic" w:hAnsi="Malgun Gothic"/>
+                <w:b/>
+                <w:bCs/>
+                <w:color w:val="059669"/>
+                <w:sz w:val="16"/>
+                <w:szCs w:val="16"/>
+              </w:rPr>
+              <w:t xml:space="preserve">▸ 본인의 역할</w:t>
+            </w:r>
+          </w:p>
+          <w:p>
+            <w:pPr>
+              <w:spacing w:after="20" w:before="20"/>
+              <w:ind w:left="200"/>
+            </w:pPr>
+            <w:r>
+              <w:rPr>
+                <w:rFonts w:ascii="Malgun Gothic" w:cs="Malgun Gothic" w:eastAsia="Malgun Gothic" w:hAnsi="Malgun Gothic"/>
+                <w:b/>
+                <w:bCs/>
+                <w:color w:val="059669"/>
+                <w:sz w:val="16"/>
+                <w:szCs w:val="16"/>
+              </w:rPr>
+              <w:t xml:space="preserve">1) </w:t>
+            </w:r>
+            <w:r>
+              <w:rPr>
+                <w:rFonts w:ascii="Malgun Gothic" w:cs="Malgun Gothic" w:eastAsia="Malgun Gothic" w:hAnsi="Malgun Gothic"/>
+                <w:color w:val="111827"/>
+                <w:sz w:val="16"/>
+                <w:szCs w:val="16"/>
+              </w:rPr>
+              <w:t xml:space="preserve">기획, 설계, 개발 1인 수행 및 사내 배포</w:t>
+            </w:r>
+          </w:p>
+          <w:p>
+            <w:pPr>
+              <w:spacing w:after="20" w:before="20"/>
+              <w:ind w:left="200"/>
+            </w:pPr>
+            <w:r>
+              <w:rPr>
+                <w:rFonts w:ascii="Malgun Gothic" w:cs="Malgun Gothic" w:eastAsia="Malgun Gothic" w:hAnsi="Malgun Gothic"/>
+                <w:b/>
+                <w:bCs/>
+                <w:color w:val="059669"/>
+                <w:sz w:val="16"/>
+                <w:szCs w:val="16"/>
+              </w:rPr>
+              <w:t xml:space="preserve">2) </w:t>
+            </w:r>
+            <w:r>
+              <w:rPr>
+                <w:rFonts w:ascii="Malgun Gothic" w:cs="Malgun Gothic" w:eastAsia="Malgun Gothic" w:hAnsi="Malgun Gothic"/>
+                <w:color w:val="111827"/>
+                <w:sz w:val="16"/>
+                <w:szCs w:val="16"/>
+              </w:rPr>
+              <w:t xml:space="preserve">Python · Streamlit · OpenAI API · PyMuPDF</w:t>
+            </w:r>
+          </w:p>
+        </w:tc>
+      </w:tr>
+    </w:tbl>
+    <w:p>
+      <w:pPr>
+        <w:spacing w:after="0" w:before="100"/>
+      </w:pPr>
+      <w:r>
+        <w:rPr>
+          <w:rFonts w:ascii="Malgun Gothic" w:cs="Malgun Gothic" w:eastAsia="Malgun Gothic" w:hAnsi="Malgun Gothic"/>
+        </w:rPr>
+        <w:t xml:space="preserve"/>
+      </w:r>
+    </w:p>
+    <w:p>
+      <w:pPr>
+        <w:spacing w:after="40" w:before="60"/>
+      </w:pPr>
+      <w:r>
+        <w:rPr>
+          <w:rFonts w:ascii="Malgun Gothic" w:cs="Malgun Gothic" w:eastAsia="Malgun Gothic" w:hAnsi="Malgun Gothic"/>
+          <w:b/>
+          <w:bCs/>
+          <w:color w:val="059669"/>
+          <w:sz w:val="16"/>
+          <w:szCs w:val="16"/>
+        </w:rPr>
+        <w:t xml:space="preserve">▸ 사업 제안</w:t>
+      </w:r>
+    </w:p>
+    <w:p>
+      <w:pPr>
+        <w:spacing w:after="20" w:before="20"/>
+        <w:ind w:left="200"/>
+      </w:pPr>
+      <w:r>
+        <w:rPr>
+          <w:rFonts w:ascii="Malgun Gothic" w:cs="Malgun Gothic" w:eastAsia="Malgun Gothic" w:hAnsi="Malgun Gothic"/>
+          <w:b/>
+          <w:bCs/>
+          <w:color w:val="059669"/>
+          <w:sz w:val="16"/>
+          <w:szCs w:val="16"/>
+        </w:rPr>
+        <w:t xml:space="preserve">· </w:t>
+      </w:r>
+      <w:r>
+        <w:rPr>
+          <w:rFonts w:ascii="Malgun Gothic" w:cs="Malgun Gothic" w:eastAsia="Malgun Gothic" w:hAnsi="Malgun Gothic"/>
+          <w:color w:val="111827"/>
+          <w:sz w:val="16"/>
+          <w:szCs w:val="16"/>
+        </w:rPr>
+        <w:t xml:space="preserve">금융감독원 AI 기반 불공정거래 대응체계 마련사업 — AI 부문 제안서 작성</w:t>
+      </w:r>
+    </w:p>
+    <w:p>
+      <w:pPr>
+        <w:spacing w:after="20" w:before="20"/>
+        <w:ind w:left="200"/>
+      </w:pPr>
+      <w:r>
+        <w:rPr>
+          <w:rFonts w:ascii="Malgun Gothic" w:cs="Malgun Gothic" w:eastAsia="Malgun Gothic" w:hAnsi="Malgun Gothic"/>
+          <w:b/>
+          <w:bCs/>
+          <w:color w:val="059669"/>
+          <w:sz w:val="16"/>
+          <w:szCs w:val="16"/>
+        </w:rPr>
+        <w:t xml:space="preserve">· </w:t>
+      </w:r>
+      <w:r>
+        <w:rPr>
+          <w:rFonts w:ascii="Malgun Gothic" w:cs="Malgun Gothic" w:eastAsia="Malgun Gothic" w:hAnsi="Malgun Gothic"/>
+          <w:color w:val="111827"/>
+          <w:sz w:val="16"/>
+          <w:szCs w:val="16"/>
+        </w:rPr>
+        <w:t xml:space="preserve">국방부 VLIW 병렬 아키텍처 해석 시스템 도입 — 제안서 작성</w:t>
+      </w:r>
+    </w:p>
     <w:p>
       <w:pPr>
         <w:spacing w:after="0" w:before="160"/>

</xml_diff>